<commit_message>
The entry sheet ends on one day in 2027, like the hub and the deck
Co-Authored-By: Claude Fable 5.1 <noreply@anthropic.com>
</commit_message>
<xml_diff>
--- a/Fujie_Creative/05_submission/エントリーシート_記入済.docx
+++ b/Fujie_Creative/05_submission/エントリーシート_記入済.docx
@@ -114,7 +114,7 @@
           <w:rFonts w:ascii="ＭＳ 明朝" w:hAnsi="ＭＳ 明朝"/>
           <w:noProof/>
         </w:rPr>
-        <w:pict w14:anchorId="20362103">
+        <w:pict w14:anchorId="5BBCD9D7">
           <v:shapetype id="_x0000_t75" coordsize="21600,21600" o:spt="75" o:preferrelative="t" path="m@4@5l@4@11@9@11@9@5xe" filled="f" stroked="f">
             <v:stroke joinstyle="miter"/>
             <v:formulas>
@@ -1045,6 +1045,111 @@
                 <w:szCs w:val="21"/>
               </w:rPr>
               <w:t>ちびフジィ、スタンプ、映像、養魚場の公開体制 ―― いずれも一度作れば残り、翌年以降の施策の土台になります。単発の広告とは異なり、時間とともに価値が増していきます。７．複数部門で推進できるフジィが「絶滅危惧種を、獲らずに育てる技術」の象徴になることで、広報活動だけでなく、統合報告書・サステナビリティ報告・SDGs（目標14「海の豊かさを守ろう」）の文脈でも語れるようになります。予算と推進主体を一部門に依存しない企画になります。８．来年度の計画として、すぐに動かせる2027年という明確な節目があるため、「いつか実施する案」ではなく「2027年度に実施する計画」として検討できます。第1期の制作物（ちびフジィ、スタンプ128種、体験版）は本エントリーにすべて添付済みです。</w:t>
+            </w:r>
+          </w:p>
+          <w:p>
+            <w:pPr>
+              <w:jc w:val="left"/>
+              <w:rPr>
+                <w:rFonts w:ascii="游明朝" w:eastAsia="游明朝" w:hAnsi="游明朝"/>
+                <w:szCs w:val="21"/>
+              </w:rPr>
+            </w:pPr>
+          </w:p>
+          <w:p>
+            <w:pPr>
+              <w:jc w:val="left"/>
+              <w:rPr>
+                <w:rFonts w:ascii="游明朝" w:eastAsia="游明朝" w:hAnsi="游明朝"/>
+                <w:szCs w:val="21"/>
+              </w:rPr>
+            </w:pPr>
+            <w:r>
+              <w:rPr>
+                <w:rFonts w:ascii="游明朝" w:eastAsia="游明朝" w:hAnsi="游明朝"/>
+                <w:szCs w:val="21"/>
+              </w:rPr>
+              <w:t>■ 2027 年の、ある一日 ―― 効果は視聴率ではなく、こういう一日として現れます</w:t>
+            </w:r>
+          </w:p>
+          <w:p>
+            <w:pPr>
+              <w:jc w:val="left"/>
+              <w:rPr>
+                <w:rFonts w:ascii="游明朝" w:eastAsia="游明朝" w:hAnsi="游明朝"/>
+                <w:szCs w:val="21"/>
+              </w:rPr>
+            </w:pPr>
+            <w:r>
+              <w:rPr>
+                <w:rFonts w:ascii="游明朝" w:eastAsia="游明朝" w:hAnsi="游明朝"/>
+                <w:szCs w:val="21"/>
+              </w:rPr>
+              <w:t>【朝】常陸太田・里美養魚場、給餌の 7 時。水面が一斉に沸き立つ 20 秒を飼育員が撮り、ちびフジィの声で「今日もごはん。1 万匹分」と投稿します。114 人だったフォロワーは毎週この光景を見てきました。県水産課の担当者もその一人で、庁内に転送します。</w:t>
+            </w:r>
+          </w:p>
+          <w:p>
+            <w:pPr>
+              <w:jc w:val="left"/>
+              <w:rPr>
+                <w:rFonts w:ascii="游明朝" w:eastAsia="游明朝" w:hAnsi="游明朝"/>
+                <w:szCs w:val="21"/>
+              </w:rPr>
+            </w:pPr>
+            <w:r>
+              <w:rPr>
+                <w:rFonts w:ascii="游明朝" w:eastAsia="游明朝" w:hAnsi="游明朝"/>
+                <w:szCs w:val="21"/>
+              </w:rPr>
+              <w:t>【昼】大阪の高校、社会科の教室。配布資料の QR コードから 90 秒後、40 台のスマートフォンに成魚が泳いでいます。「この会社なに？」「バルブの会社。この魚を世界で初めて卵から育てた」。その一人が三年後の採用説明会でこの日を話します。</w:t>
+            </w:r>
+          </w:p>
+          <w:p>
+            <w:pPr>
+              <w:jc w:val="left"/>
+              <w:rPr>
+                <w:rFonts w:ascii="游明朝" w:eastAsia="游明朝" w:hAnsi="游明朝"/>
+                <w:szCs w:val="21"/>
+              </w:rPr>
+            </w:pPr>
+            <w:r>
+              <w:rPr>
+                <w:rFonts w:ascii="游明朝" w:eastAsia="游明朝" w:hAnsi="游明朝"/>
+                <w:szCs w:val="21"/>
+              </w:rPr>
+              <w:t>【夕】友だちのグループチャット。「サメじゃないです」のスタンプが送られ、「チョウザメ。絶滅しそうな魚を獲らずに増やせるようにした会社がいる」と会話が始まります。フジキンはこの会話に一円も払っていません。</w:t>
+            </w:r>
+          </w:p>
+          <w:p>
+            <w:pPr>
+              <w:jc w:val="left"/>
+              <w:rPr>
+                <w:rFonts w:ascii="游明朝" w:eastAsia="游明朝" w:hAnsi="游明朝"/>
+                <w:szCs w:val="21"/>
+              </w:rPr>
+            </w:pPr>
+            <w:r>
+              <w:rPr>
+                <w:rFonts w:ascii="游明朝" w:eastAsia="游明朝" w:hAnsi="游明朝"/>
+                <w:szCs w:val="21"/>
+              </w:rPr>
+              <w:t>【夜】どこかの家の食卓。お歳暮の国産キャビア缶に小さな銀色の魚。「里美のやつだ。今度見に行こう」。缶の生産者はフジキンから稚魚を買う会社で、キャラクターの使用料はかかっていません。</w:t>
+            </w:r>
+          </w:p>
+          <w:p>
+            <w:pPr>
+              <w:jc w:val="left"/>
+              <w:rPr>
+                <w:rFonts w:ascii="游明朝" w:eastAsia="游明朝" w:hAnsi="游明朝"/>
+                <w:szCs w:val="21"/>
+              </w:rPr>
+            </w:pPr>
+            <w:r>
+              <w:rPr>
+                <w:rFonts w:ascii="游明朝" w:eastAsia="游明朝" w:hAnsi="游明朝"/>
+                <w:szCs w:val="21"/>
+              </w:rPr>
+              <w:t>四つの場面に共通するのは、誰かがフジキンの話を自分の言葉でしていることです。それが「覚えられる会社」と「語られる会社」の差です。</w:t>
             </w:r>
           </w:p>
           <w:p>

</xml_diff>

<commit_message>
The entry sheet's answer box is set smaller so the 2027 scenes fit on three pages
Co-Authored-By: Claude Fable 5.1 <noreply@anthropic.com>
</commit_message>
<xml_diff>
--- a/Fujie_Creative/05_submission/エントリーシート_記入済.docx
+++ b/Fujie_Creative/05_submission/エントリーシート_記入済.docx
@@ -114,7 +114,7 @@
           <w:rFonts w:ascii="ＭＳ 明朝" w:hAnsi="ＭＳ 明朝"/>
           <w:noProof/>
         </w:rPr>
-        <w:pict w14:anchorId="5BBCD9D7">
+        <w:pict w14:anchorId="1A16B7FD">
           <v:shapetype id="_x0000_t75" coordsize="21600,21600" o:spt="75" o:preferrelative="t" path="m@4@5l@4@11@9@11@9@5xe" filled="f" stroked="f">
             <v:stroke joinstyle="miter"/>
             <v:formulas>
@@ -529,12 +529,14 @@
               <w:jc w:val="left"/>
               <w:rPr>
                 <w:rFonts w:ascii="游明朝" w:eastAsia="游明朝" w:hAnsi="游明朝"/>
+                <w:sz w:val="17"/>
                 <w:szCs w:val="21"/>
               </w:rPr>
             </w:pPr>
             <w:r>
               <w:rPr>
                 <w:rFonts w:ascii="游明朝" w:eastAsia="游明朝" w:hAnsi="游明朝" w:hint="eastAsia"/>
+                <w:sz w:val="17"/>
                 <w:szCs w:val="21"/>
               </w:rPr>
               <w:t>概要・ポイント</w:t>
@@ -542,6 +544,7 @@
             <w:r>
               <w:rPr>
                 <w:rFonts w:ascii="游明朝" w:eastAsia="游明朝" w:hAnsi="游明朝" w:hint="eastAsia"/>
+                <w:sz w:val="17"/>
                 <w:szCs w:val="21"/>
               </w:rPr>
               <w:t>：</w:t>
@@ -552,12 +555,14 @@
               <w:jc w:val="left"/>
               <w:rPr>
                 <w:rFonts w:ascii="游明朝" w:eastAsia="游明朝" w:hAnsi="游明朝"/>
-                <w:szCs w:val="21"/>
-              </w:rPr>
-            </w:pPr>
-            <w:r>
-              <w:rPr>
-                <w:rFonts w:ascii="游明朝" w:eastAsia="游明朝" w:hAnsi="游明朝"/>
+                <w:sz w:val="17"/>
+                <w:szCs w:val="21"/>
+              </w:rPr>
+            </w:pPr>
+            <w:r>
+              <w:rPr>
+                <w:rFonts w:ascii="游明朝" w:eastAsia="游明朝" w:hAnsi="游明朝"/>
+                <w:sz w:val="17"/>
                 <w:szCs w:val="21"/>
               </w:rPr>
               <w:t>フジィを有名にする最大の資産は、すでに社内にあります。「フジィは実在する」という事実です。</w:t>
@@ -568,12 +573,14 @@
               <w:jc w:val="left"/>
               <w:rPr>
                 <w:rFonts w:ascii="游明朝" w:eastAsia="游明朝" w:hAnsi="游明朝"/>
-                <w:szCs w:val="21"/>
-              </w:rPr>
-            </w:pPr>
-            <w:r>
-              <w:rPr>
-                <w:rFonts w:ascii="游明朝" w:eastAsia="游明朝" w:hAnsi="游明朝"/>
+                <w:sz w:val="17"/>
+                <w:szCs w:val="21"/>
+              </w:rPr>
+            </w:pPr>
+            <w:r>
+              <w:rPr>
+                <w:rFonts w:ascii="游明朝" w:eastAsia="游明朝" w:hAnsi="游明朝"/>
+                <w:sz w:val="17"/>
                 <w:szCs w:val="21"/>
               </w:rPr>
               <w:t>1987年、最高技術顧問・故 西堀栄三郎先生の「フジキンのバルブを使ってチョウザメの養殖を始めてみないか」という一言から、挑戦は始まりました。初年度の生残率はわずか5％。それでも1998年に世界初の水槽内完全養殖を達成し、2002年には日本初のキャビア出荷を実現。里美養魚場（茨城県常陸太田市）には、いまも1万尾を超える“本物のフジィ”が泳いでいます。</w:t>
@@ -584,12 +591,14 @@
               <w:jc w:val="left"/>
               <w:rPr>
                 <w:rFonts w:ascii="游明朝" w:eastAsia="游明朝" w:hAnsi="游明朝"/>
-                <w:szCs w:val="21"/>
-              </w:rPr>
-            </w:pPr>
-            <w:r>
-              <w:rPr>
-                <w:rFonts w:ascii="游明朝" w:eastAsia="游明朝" w:hAnsi="游明朝"/>
+                <w:sz w:val="17"/>
+                <w:szCs w:val="21"/>
+              </w:rPr>
+            </w:pPr>
+            <w:r>
+              <w:rPr>
+                <w:rFonts w:ascii="游明朝" w:eastAsia="游明朝" w:hAnsi="游明朝"/>
+                <w:sz w:val="17"/>
                 <w:szCs w:val="21"/>
               </w:rPr>
               <w:t>バルブメーカーが、日本の国産キャビアを生んだ。これほど人に話したくなる物語を持つBtoB企業は、他にありません。さらに、この物語には続きがあります。チョウザメはIUCNレッドリストで「もっとも絶滅の危機にある生物群」とされ、現存する全種が絶滅危惧種です。完全養殖とは、「もう川から一尾も獲らなくていい」という技術にほかなりません。フジキンがつくったのは珍味ではなく、この魚を獲らずに済ませる方法でした。食の話にとどめず保全の話として語ることで、広報だけでなくサステナビリティ・統合報告の文脈にも乗せられます。しかし現在、この物語はフジィと結びついていません。本企画は、この物語を軸にフジィを「シンボル」から「キャラクター」へ育てる計画です。</w:t>
@@ -600,12 +609,14 @@
               <w:jc w:val="left"/>
               <w:rPr>
                 <w:rFonts w:ascii="游明朝" w:eastAsia="游明朝" w:hAnsi="游明朝"/>
-                <w:szCs w:val="21"/>
-              </w:rPr>
-            </w:pPr>
-            <w:r>
-              <w:rPr>
-                <w:rFonts w:ascii="游明朝" w:eastAsia="游明朝" w:hAnsi="游明朝"/>
+                <w:sz w:val="17"/>
+                <w:szCs w:val="21"/>
+              </w:rPr>
+            </w:pPr>
+            <w:r>
+              <w:rPr>
+                <w:rFonts w:ascii="游明朝" w:eastAsia="游明朝" w:hAnsi="游明朝"/>
+                <w:sz w:val="17"/>
                 <w:szCs w:val="21"/>
               </w:rPr>
               <w:t>①ちびフジィ ―― 第2の姿を新設する</w:t>
@@ -616,12 +627,14 @@
               <w:jc w:val="left"/>
               <w:rPr>
                 <w:rFonts w:ascii="游明朝" w:eastAsia="游明朝" w:hAnsi="游明朝"/>
-                <w:szCs w:val="21"/>
-              </w:rPr>
-            </w:pPr>
-            <w:r>
-              <w:rPr>
-                <w:rFonts w:ascii="游明朝" w:eastAsia="游明朝" w:hAnsi="游明朝"/>
+                <w:sz w:val="17"/>
+                <w:szCs w:val="21"/>
+              </w:rPr>
+            </w:pPr>
+            <w:r>
+              <w:rPr>
+                <w:rFonts w:ascii="游明朝" w:eastAsia="游明朝" w:hAnsi="游明朝"/>
+                <w:sz w:val="17"/>
                 <w:szCs w:val="21"/>
               </w:rPr>
               <w:t>現行マニュアルの規定は一切変更しません。従来のフジィは企業シンボルとして厳格に保護したまま、表情と親しみやすさを担う「ちびフジィ」を公式に追加します。シンボルは、笑うことも、抱きしめられることも、ファンに描かれることもできません。フジィが有名になるために不足しているのは、この一点だと考えます。</w:t>
@@ -632,14 +645,17 @@
               <w:jc w:val="left"/>
               <w:rPr>
                 <w:rFonts w:ascii="游明朝" w:eastAsia="游明朝" w:hAnsi="游明朝"/>
-                <w:szCs w:val="21"/>
-              </w:rPr>
-            </w:pPr>
-            <w:r>
-              <w:rPr>
-                <w:rFonts w:ascii="游明朝" w:eastAsia="游明朝" w:hAnsi="游明朝"/>
-                <w:szCs w:val="21"/>
-              </w:rPr>
+                <w:sz w:val="17"/>
+                <w:szCs w:val="21"/>
+              </w:rPr>
+            </w:pPr>
+            <w:r>
+              <w:rPr>
+                <w:rFonts w:ascii="游明朝" w:eastAsia="游明朝" w:hAnsi="游明朝"/>
+                <w:sz w:val="17"/>
+                <w:szCs w:val="21"/>
+              </w:rPr>
+              <w:lastRenderedPageBreak/>
               <w:t>②LINEスタンプ128種を無料配布する</w:t>
             </w:r>
           </w:p>
@@ -648,12 +664,14 @@
               <w:jc w:val="left"/>
               <w:rPr>
                 <w:rFonts w:ascii="游明朝" w:eastAsia="游明朝" w:hAnsi="游明朝"/>
-                <w:szCs w:val="21"/>
-              </w:rPr>
-            </w:pPr>
-            <w:r>
-              <w:rPr>
-                <w:rFonts w:ascii="游明朝" w:eastAsia="游明朝" w:hAnsi="游明朝"/>
+                <w:sz w:val="17"/>
+                <w:szCs w:val="21"/>
+              </w:rPr>
+            </w:pPr>
+            <w:r>
+              <w:rPr>
+                <w:rFonts w:ascii="游明朝" w:eastAsia="游明朝" w:hAnsi="游明朝"/>
+                <w:sz w:val="17"/>
                 <w:szCs w:val="21"/>
               </w:rPr>
               <w:t>公式アカウントの友だち追加を条件とした無料配布は、日本において最も費用対効果の高い認知獲得手段です。スタンプは「友人が」「私的な会話の中で」「自発的に」送るため、広告では到達できない場所に届きます。本エントリーでは、実際に使用可能な128種（日本語64種・英語64種）を制作し、一点ずつ切り出した状態で別資料に添付しています。</w:t>
@@ -664,12 +682,14 @@
               <w:jc w:val="left"/>
               <w:rPr>
                 <w:rFonts w:ascii="游明朝" w:eastAsia="游明朝" w:hAnsi="游明朝"/>
-                <w:szCs w:val="21"/>
-              </w:rPr>
-            </w:pPr>
-            <w:r>
-              <w:rPr>
-                <w:rFonts w:ascii="游明朝" w:eastAsia="游明朝" w:hAnsi="游明朝"/>
+                <w:sz w:val="17"/>
+                <w:szCs w:val="21"/>
+              </w:rPr>
+            </w:pPr>
+            <w:r>
+              <w:rPr>
+                <w:rFonts w:ascii="游明朝" w:eastAsia="游明朝" w:hAnsi="游明朝"/>
+                <w:sz w:val="17"/>
                 <w:szCs w:val="21"/>
               </w:rPr>
               <w:t>③フジィに“中の人”を与える</w:t>
@@ -680,12 +700,14 @@
               <w:jc w:val="left"/>
               <w:rPr>
                 <w:rFonts w:ascii="游明朝" w:eastAsia="游明朝" w:hAnsi="游明朝"/>
-                <w:szCs w:val="21"/>
-              </w:rPr>
-            </w:pPr>
-            <w:r>
-              <w:rPr>
-                <w:rFonts w:ascii="游明朝" w:eastAsia="游明朝" w:hAnsi="游明朝"/>
+                <w:sz w:val="17"/>
+                <w:szCs w:val="21"/>
+              </w:rPr>
+            </w:pPr>
+            <w:r>
+              <w:rPr>
+                <w:rFonts w:ascii="游明朝" w:eastAsia="游明朝" w:hAnsi="游明朝"/>
+                <w:sz w:val="17"/>
                 <w:szCs w:val="21"/>
               </w:rPr>
               <w:t>公式Instagramは現在114フォロワー。これは弱点ではなく、余白です。1万尾の給餌風景、ふ化の瞬間、夜明けの養魚場 ―― 誰も見たことのない映像を、フジキンだけが持っています。</w:t>
@@ -696,12 +718,14 @@
               <w:jc w:val="left"/>
               <w:rPr>
                 <w:rFonts w:ascii="游明朝" w:eastAsia="游明朝" w:hAnsi="游明朝"/>
-                <w:szCs w:val="21"/>
-              </w:rPr>
-            </w:pPr>
-            <w:r>
-              <w:rPr>
-                <w:rFonts w:ascii="游明朝" w:eastAsia="游明朝" w:hAnsi="游明朝"/>
+                <w:sz w:val="17"/>
+                <w:szCs w:val="21"/>
+              </w:rPr>
+            </w:pPr>
+            <w:r>
+              <w:rPr>
+                <w:rFonts w:ascii="游明朝" w:eastAsia="游明朝" w:hAnsi="游明朝"/>
+                <w:sz w:val="17"/>
                 <w:szCs w:val="21"/>
               </w:rPr>
               <w:t>④ちびフジィを無償開放する</w:t>
@@ -712,12 +736,14 @@
               <w:jc w:val="left"/>
               <w:rPr>
                 <w:rFonts w:ascii="游明朝" w:eastAsia="游明朝" w:hAnsi="游明朝"/>
-                <w:szCs w:val="21"/>
-              </w:rPr>
-            </w:pPr>
-            <w:r>
-              <w:rPr>
-                <w:rFonts w:ascii="游明朝" w:eastAsia="游明朝" w:hAnsi="游明朝"/>
+                <w:sz w:val="17"/>
+                <w:szCs w:val="21"/>
+              </w:rPr>
+            </w:pPr>
+            <w:r>
+              <w:rPr>
+                <w:rFonts w:ascii="游明朝" w:eastAsia="游明朝" w:hAnsi="游明朝"/>
+                <w:sz w:val="17"/>
                 <w:szCs w:val="21"/>
               </w:rPr>
               <w:t>フジキンはチョウザメの稚魚を全国の養殖業者へ販売しています。その取引先に無償開放すれば、日本中の国産キャビア生産者のパッケージが、そのままフジキンの広告になります。追加費用はかからず、既存の取引網だけで成立します。</w:t>
@@ -728,12 +754,14 @@
               <w:jc w:val="left"/>
               <w:rPr>
                 <w:rFonts w:ascii="游明朝" w:eastAsia="游明朝" w:hAnsi="游明朝"/>
-                <w:szCs w:val="21"/>
-              </w:rPr>
-            </w:pPr>
-            <w:r>
-              <w:rPr>
-                <w:rFonts w:ascii="游明朝" w:eastAsia="游明朝" w:hAnsi="游明朝"/>
+                <w:sz w:val="17"/>
+                <w:szCs w:val="21"/>
+              </w:rPr>
+            </w:pPr>
+            <w:r>
+              <w:rPr>
+                <w:rFonts w:ascii="游明朝" w:eastAsia="游明朝" w:hAnsi="游明朝"/>
+                <w:sz w:val="17"/>
                 <w:szCs w:val="21"/>
               </w:rPr>
               <w:t>⑤「会いに行けるマスコット」にする</w:t>
@@ -744,12 +772,14 @@
               <w:jc w:val="left"/>
               <w:rPr>
                 <w:rFonts w:ascii="游明朝" w:eastAsia="游明朝" w:hAnsi="游明朝"/>
-                <w:szCs w:val="21"/>
-              </w:rPr>
-            </w:pPr>
-            <w:r>
-              <w:rPr>
-                <w:rFonts w:ascii="游明朝" w:eastAsia="游明朝" w:hAnsi="游明朝"/>
+                <w:sz w:val="17"/>
+                <w:szCs w:val="21"/>
+              </w:rPr>
+            </w:pPr>
+            <w:r>
+              <w:rPr>
+                <w:rFonts w:ascii="游明朝" w:eastAsia="游明朝" w:hAnsi="游明朝"/>
+                <w:sz w:val="17"/>
                 <w:szCs w:val="21"/>
               </w:rPr>
               <w:t>里美養魚場の限定公開。日本で唯一、餌やりができる企業マスコットになります。茨城県は「霞ヶ浦キャビア」で国内一の産地を目指しており、協力相手として利害が完全に一致します。</w:t>
@@ -760,12 +790,14 @@
               <w:jc w:val="left"/>
               <w:rPr>
                 <w:rFonts w:ascii="游明朝" w:eastAsia="游明朝" w:hAnsi="游明朝"/>
-                <w:szCs w:val="21"/>
-              </w:rPr>
-            </w:pPr>
-            <w:r>
-              <w:rPr>
-                <w:rFonts w:ascii="游明朝" w:eastAsia="游明朝" w:hAnsi="游明朝"/>
+                <w:sz w:val="17"/>
+                <w:szCs w:val="21"/>
+              </w:rPr>
+            </w:pPr>
+            <w:r>
+              <w:rPr>
+                <w:rFonts w:ascii="游明朝" w:eastAsia="游明朝" w:hAnsi="游明朝"/>
+                <w:sz w:val="17"/>
                 <w:szCs w:val="21"/>
               </w:rPr>
               <w:t>⑥1987年の物語を映像化する</w:t>
@@ -776,12 +808,14 @@
               <w:jc w:val="left"/>
               <w:rPr>
                 <w:rFonts w:ascii="游明朝" w:eastAsia="游明朝" w:hAnsi="游明朝"/>
-                <w:szCs w:val="21"/>
-              </w:rPr>
-            </w:pPr>
-            <w:r>
-              <w:rPr>
-                <w:rFonts w:ascii="游明朝" w:eastAsia="游明朝" w:hAnsi="游明朝"/>
+                <w:sz w:val="17"/>
+                <w:szCs w:val="21"/>
+              </w:rPr>
+            </w:pPr>
+            <w:r>
+              <w:rPr>
+                <w:rFonts w:ascii="游明朝" w:eastAsia="游明朝" w:hAnsi="游明朝"/>
+                <w:sz w:val="17"/>
                 <w:szCs w:val="21"/>
               </w:rPr>
               <w:t>ソ連視察、ボルガ川の船上で初めて口にしたキャビア、生残率5％の初年度、そして世界初へ。ロケ地はすべて自社保有であり、制作費以外の追加投資を必要としません。⑦「サメじゃないです。」を入口の一言にするチョウザメは「蝶のサメ」と書くため、ほぼ全員が最初にサメだと誤解します。フジキンのキャビアサイトにも「サメとの違い」というページがあるほどです。この誤解を直すのではなく、入口として使います。「サメじゃないです。」に続けて「サメより、ずっと少ないんです。」と言えば、二行でチョウザメの正体と、この魚がおかれた状況が同時に伝わります。キャラクター最大の弱点（サメに見えること）が、そのまま最大の入口になります。なお、この一言を発するのは「ちびフジィ」であり、公式フジィに文字を重ねることはしません（マニュアル第7条）。実施時期について。2027年は、1987年の挑戦開始から40年、2002年の初出荷から25年にあたります。本コンテストの結果発表は2026年12月であり、本企画はそのまま2027年度の計画に乗せることができます。2028年には完全養殖から30年、そして2030年には創業100周年。創業100周年を、フジィが有名になった状態で迎えることを目標とします。</w:t>
@@ -792,33 +826,37 @@
               <w:jc w:val="left"/>
               <w:rPr>
                 <w:rFonts w:ascii="游明朝" w:eastAsia="游明朝" w:hAnsi="游明朝" w:hint="eastAsia"/>
-                <w:szCs w:val="21"/>
-              </w:rPr>
-            </w:pPr>
-          </w:p>
-          <w:p>
-            <w:pPr>
-              <w:jc w:val="left"/>
-              <w:rPr>
-                <w:rFonts w:ascii="游明朝" w:eastAsia="游明朝" w:hAnsi="游明朝"/>
-                <w:szCs w:val="21"/>
-              </w:rPr>
-            </w:pPr>
-          </w:p>
-          <w:p>
-            <w:pPr>
-              <w:jc w:val="left"/>
-              <w:rPr>
-                <w:rFonts w:ascii="游明朝" w:eastAsia="游明朝" w:hAnsi="游明朝"/>
-                <w:szCs w:val="21"/>
-              </w:rPr>
-            </w:pPr>
-          </w:p>
-          <w:p>
-            <w:pPr>
-              <w:jc w:val="left"/>
-              <w:rPr>
-                <w:rFonts w:ascii="游明朝" w:eastAsia="游明朝" w:hAnsi="游明朝"/>
+                <w:sz w:val="17"/>
+                <w:szCs w:val="21"/>
+              </w:rPr>
+            </w:pPr>
+          </w:p>
+          <w:p>
+            <w:pPr>
+              <w:jc w:val="left"/>
+              <w:rPr>
+                <w:rFonts w:ascii="游明朝" w:eastAsia="游明朝" w:hAnsi="游明朝"/>
+                <w:sz w:val="17"/>
+                <w:szCs w:val="21"/>
+              </w:rPr>
+            </w:pPr>
+          </w:p>
+          <w:p>
+            <w:pPr>
+              <w:jc w:val="left"/>
+              <w:rPr>
+                <w:rFonts w:ascii="游明朝" w:eastAsia="游明朝" w:hAnsi="游明朝"/>
+                <w:sz w:val="17"/>
+                <w:szCs w:val="21"/>
+              </w:rPr>
+            </w:pPr>
+          </w:p>
+          <w:p>
+            <w:pPr>
+              <w:jc w:val="left"/>
+              <w:rPr>
+                <w:rFonts w:ascii="游明朝" w:eastAsia="游明朝" w:hAnsi="游明朝"/>
+                <w:sz w:val="17"/>
                 <w:szCs w:val="21"/>
               </w:rPr>
             </w:pPr>
@@ -828,21 +866,24 @@
               <w:jc w:val="left"/>
               <w:rPr>
                 <w:rFonts w:ascii="游明朝" w:eastAsia="游明朝" w:hAnsi="游明朝" w:hint="eastAsia"/>
-                <w:szCs w:val="21"/>
-              </w:rPr>
-            </w:pPr>
-          </w:p>
-          <w:p>
-            <w:pPr>
-              <w:jc w:val="left"/>
-              <w:rPr>
-                <w:rFonts w:ascii="游明朝" w:eastAsia="游明朝" w:hAnsi="游明朝"/>
+                <w:sz w:val="17"/>
+                <w:szCs w:val="21"/>
+              </w:rPr>
+            </w:pPr>
+          </w:p>
+          <w:p>
+            <w:pPr>
+              <w:jc w:val="left"/>
+              <w:rPr>
+                <w:rFonts w:ascii="游明朝" w:eastAsia="游明朝" w:hAnsi="游明朝"/>
+                <w:sz w:val="17"/>
                 <w:szCs w:val="21"/>
               </w:rPr>
             </w:pPr>
             <w:r>
               <w:rPr>
                 <w:rFonts w:ascii="游明朝" w:eastAsia="游明朝" w:hAnsi="游明朝" w:hint="eastAsia"/>
+                <w:sz w:val="17"/>
                 <w:szCs w:val="21"/>
               </w:rPr>
               <w:t>期待される</w:t>
@@ -850,6 +891,7 @@
             <w:r>
               <w:rPr>
                 <w:rFonts w:ascii="游明朝" w:eastAsia="游明朝" w:hAnsi="游明朝" w:hint="eastAsia"/>
+                <w:sz w:val="17"/>
                 <w:szCs w:val="21"/>
               </w:rPr>
               <w:t>効果：</w:t>
@@ -860,12 +902,14 @@
               <w:jc w:val="left"/>
               <w:rPr>
                 <w:rFonts w:ascii="游明朝" w:eastAsia="游明朝" w:hAnsi="游明朝"/>
-                <w:szCs w:val="21"/>
-              </w:rPr>
-            </w:pPr>
-            <w:r>
-              <w:rPr>
-                <w:rFonts w:ascii="游明朝" w:eastAsia="游明朝" w:hAnsi="游明朝"/>
+                <w:sz w:val="17"/>
+                <w:szCs w:val="21"/>
+              </w:rPr>
+            </w:pPr>
+            <w:r>
+              <w:rPr>
+                <w:rFonts w:ascii="游明朝" w:eastAsia="游明朝" w:hAnsi="游明朝"/>
+                <w:sz w:val="17"/>
                 <w:szCs w:val="21"/>
               </w:rPr>
               <w:t>１．「覚えられる会社」から「語られる会社」へ</w:t>
@@ -876,12 +920,14 @@
               <w:jc w:val="left"/>
               <w:rPr>
                 <w:rFonts w:ascii="游明朝" w:eastAsia="游明朝" w:hAnsi="游明朝"/>
-                <w:szCs w:val="21"/>
-              </w:rPr>
-            </w:pPr>
-            <w:r>
-              <w:rPr>
-                <w:rFonts w:ascii="游明朝" w:eastAsia="游明朝" w:hAnsi="游明朝"/>
+                <w:sz w:val="17"/>
+                <w:szCs w:val="21"/>
+              </w:rPr>
+            </w:pPr>
+            <w:r>
+              <w:rPr>
+                <w:rFonts w:ascii="游明朝" w:eastAsia="游明朝" w:hAnsi="游明朝"/>
+                <w:sz w:val="17"/>
                 <w:szCs w:val="21"/>
               </w:rPr>
               <w:t>グッズは配れば終わりますが、物語は人が人に話します。「バルブの会社が日本のキャビアをつくった」という一文は、聞いた人が翌日 誰かに話したくなる強度を持っています。広告費をかけずに伝播する、唯一の資産です。</w:t>
@@ -892,12 +938,14 @@
               <w:jc w:val="left"/>
               <w:rPr>
                 <w:rFonts w:ascii="游明朝" w:eastAsia="游明朝" w:hAnsi="游明朝"/>
-                <w:szCs w:val="21"/>
-              </w:rPr>
-            </w:pPr>
-            <w:r>
-              <w:rPr>
-                <w:rFonts w:ascii="游明朝" w:eastAsia="游明朝" w:hAnsi="游明朝"/>
+                <w:sz w:val="17"/>
+                <w:szCs w:val="21"/>
+              </w:rPr>
+            </w:pPr>
+            <w:r>
+              <w:rPr>
+                <w:rFonts w:ascii="游明朝" w:eastAsia="游明朝" w:hAnsi="游明朝"/>
+                <w:sz w:val="17"/>
                 <w:szCs w:val="21"/>
               </w:rPr>
               <w:t>２．一般層への継続的な到達</w:t>
@@ -908,12 +956,14 @@
               <w:jc w:val="left"/>
               <w:rPr>
                 <w:rFonts w:ascii="游明朝" w:eastAsia="游明朝" w:hAnsi="游明朝"/>
-                <w:szCs w:val="21"/>
-              </w:rPr>
-            </w:pPr>
-            <w:r>
-              <w:rPr>
-                <w:rFonts w:ascii="游明朝" w:eastAsia="游明朝" w:hAnsi="游明朝"/>
+                <w:sz w:val="17"/>
+                <w:szCs w:val="21"/>
+              </w:rPr>
+            </w:pPr>
+            <w:r>
+              <w:rPr>
+                <w:rFonts w:ascii="游明朝" w:eastAsia="游明朝" w:hAnsi="游明朝"/>
+                <w:sz w:val="17"/>
                 <w:szCs w:val="21"/>
               </w:rPr>
               <w:t>LINEスタンプは、送信されるかぎり露出が続きます。一度の制作費で、個人間の会話という最も信頼された場所に、繰り返しフジィが現れ続けます。</w:t>
@@ -924,12 +974,14 @@
               <w:jc w:val="left"/>
               <w:rPr>
                 <w:rFonts w:ascii="游明朝" w:eastAsia="游明朝" w:hAnsi="游明朝"/>
-                <w:szCs w:val="21"/>
-              </w:rPr>
-            </w:pPr>
-            <w:r>
-              <w:rPr>
-                <w:rFonts w:ascii="游明朝" w:eastAsia="游明朝" w:hAnsi="游明朝"/>
+                <w:sz w:val="17"/>
+                <w:szCs w:val="21"/>
+              </w:rPr>
+            </w:pPr>
+            <w:r>
+              <w:rPr>
+                <w:rFonts w:ascii="游明朝" w:eastAsia="游明朝" w:hAnsi="游明朝"/>
+                <w:sz w:val="17"/>
                 <w:szCs w:val="21"/>
               </w:rPr>
               <w:t>３．取引先を通じた面の拡大</w:t>
@@ -940,12 +992,14 @@
               <w:jc w:val="left"/>
               <w:rPr>
                 <w:rFonts w:ascii="游明朝" w:eastAsia="游明朝" w:hAnsi="游明朝"/>
-                <w:szCs w:val="21"/>
-              </w:rPr>
-            </w:pPr>
-            <w:r>
-              <w:rPr>
-                <w:rFonts w:ascii="游明朝" w:eastAsia="游明朝" w:hAnsi="游明朝"/>
+                <w:sz w:val="17"/>
+                <w:szCs w:val="21"/>
+              </w:rPr>
+            </w:pPr>
+            <w:r>
+              <w:rPr>
+                <w:rFonts w:ascii="游明朝" w:eastAsia="游明朝" w:hAnsi="游明朝"/>
+                <w:sz w:val="17"/>
                 <w:szCs w:val="21"/>
               </w:rPr>
               <w:t>稚魚取引先への無償開放により、フジキンが直接リーチできない一般消費者の食卓にフジィが届きます。BtoB企業がBtoCに到達する、現実的で低コストな経路です。</w:t>
@@ -956,14 +1010,17 @@
               <w:jc w:val="left"/>
               <w:rPr>
                 <w:rFonts w:ascii="游明朝" w:eastAsia="游明朝" w:hAnsi="游明朝"/>
-                <w:szCs w:val="21"/>
-              </w:rPr>
-            </w:pPr>
-            <w:r>
-              <w:rPr>
-                <w:rFonts w:ascii="游明朝" w:eastAsia="游明朝" w:hAnsi="游明朝"/>
-                <w:szCs w:val="21"/>
-              </w:rPr>
+                <w:sz w:val="17"/>
+                <w:szCs w:val="21"/>
+              </w:rPr>
+            </w:pPr>
+            <w:r>
+              <w:rPr>
+                <w:rFonts w:ascii="游明朝" w:eastAsia="游明朝" w:hAnsi="游明朝"/>
+                <w:sz w:val="17"/>
+                <w:szCs w:val="21"/>
+              </w:rPr>
+              <w:lastRenderedPageBreak/>
               <w:t>４．採用広報への波及</w:t>
             </w:r>
           </w:p>
@@ -972,12 +1029,14 @@
               <w:jc w:val="left"/>
               <w:rPr>
                 <w:rFonts w:ascii="游明朝" w:eastAsia="游明朝" w:hAnsi="游明朝"/>
-                <w:szCs w:val="21"/>
-              </w:rPr>
-            </w:pPr>
-            <w:r>
-              <w:rPr>
-                <w:rFonts w:ascii="游明朝" w:eastAsia="游明朝" w:hAnsi="游明朝"/>
+                <w:sz w:val="17"/>
+                <w:szCs w:val="21"/>
+              </w:rPr>
+            </w:pPr>
+            <w:r>
+              <w:rPr>
+                <w:rFonts w:ascii="游明朝" w:eastAsia="游明朝" w:hAnsi="游明朝"/>
+                <w:sz w:val="17"/>
                 <w:szCs w:val="21"/>
               </w:rPr>
               <w:t>生残率5％から世界初に至った11年間は、企業ポリシー「極限への挑戦」そのものです。説明する言葉ではなく実話として語れるため、学生が最も反応する種類の物語になります。</w:t>
@@ -988,12 +1047,14 @@
               <w:jc w:val="left"/>
               <w:rPr>
                 <w:rFonts w:ascii="游明朝" w:eastAsia="游明朝" w:hAnsi="游明朝"/>
-                <w:szCs w:val="21"/>
-              </w:rPr>
-            </w:pPr>
-            <w:r>
-              <w:rPr>
-                <w:rFonts w:ascii="游明朝" w:eastAsia="游明朝" w:hAnsi="游明朝"/>
+                <w:sz w:val="17"/>
+                <w:szCs w:val="21"/>
+              </w:rPr>
+            </w:pPr>
+            <w:r>
+              <w:rPr>
+                <w:rFonts w:ascii="游明朝" w:eastAsia="游明朝" w:hAnsi="游明朝"/>
+                <w:sz w:val="17"/>
                 <w:szCs w:val="21"/>
               </w:rPr>
               <w:t>５．地域・行政との連携</w:t>
@@ -1004,12 +1065,14 @@
               <w:jc w:val="left"/>
               <w:rPr>
                 <w:rFonts w:ascii="游明朝" w:eastAsia="游明朝" w:hAnsi="游明朝"/>
-                <w:szCs w:val="21"/>
-              </w:rPr>
-            </w:pPr>
-            <w:r>
-              <w:rPr>
-                <w:rFonts w:ascii="游明朝" w:eastAsia="游明朝" w:hAnsi="游明朝"/>
+                <w:sz w:val="17"/>
+                <w:szCs w:val="21"/>
+              </w:rPr>
+            </w:pPr>
+            <w:r>
+              <w:rPr>
+                <w:rFonts w:ascii="游明朝" w:eastAsia="游明朝" w:hAnsi="游明朝"/>
+                <w:sz w:val="17"/>
                 <w:szCs w:val="21"/>
               </w:rPr>
               <w:t>茨城県の産地化政策と目的が一致するため、県・自治体・地元メディアを無償の拡散チャネルとして活用できます。</w:t>
@@ -1020,12 +1083,14 @@
               <w:jc w:val="left"/>
               <w:rPr>
                 <w:rFonts w:ascii="游明朝" w:eastAsia="游明朝" w:hAnsi="游明朝"/>
-                <w:szCs w:val="21"/>
-              </w:rPr>
-            </w:pPr>
-            <w:r>
-              <w:rPr>
-                <w:rFonts w:ascii="游明朝" w:eastAsia="游明朝" w:hAnsi="游明朝"/>
+                <w:sz w:val="17"/>
+                <w:szCs w:val="21"/>
+              </w:rPr>
+            </w:pPr>
+            <w:r>
+              <w:rPr>
+                <w:rFonts w:ascii="游明朝" w:eastAsia="游明朝" w:hAnsi="游明朝"/>
+                <w:sz w:val="17"/>
                 <w:szCs w:val="21"/>
               </w:rPr>
               <w:t>６．資産が積み上がる</w:t>
@@ -1036,12 +1101,14 @@
               <w:jc w:val="left"/>
               <w:rPr>
                 <w:rFonts w:ascii="游明朝" w:eastAsia="游明朝" w:hAnsi="游明朝"/>
-                <w:szCs w:val="21"/>
-              </w:rPr>
-            </w:pPr>
-            <w:r>
-              <w:rPr>
-                <w:rFonts w:ascii="游明朝" w:eastAsia="游明朝" w:hAnsi="游明朝"/>
+                <w:sz w:val="17"/>
+                <w:szCs w:val="21"/>
+              </w:rPr>
+            </w:pPr>
+            <w:r>
+              <w:rPr>
+                <w:rFonts w:ascii="游明朝" w:eastAsia="游明朝" w:hAnsi="游明朝"/>
+                <w:sz w:val="17"/>
                 <w:szCs w:val="21"/>
               </w:rPr>
               <w:t>ちびフジィ、スタンプ、映像、養魚場の公開体制 ―― いずれも一度作れば残り、翌年以降の施策の土台になります。単発の広告とは異なり、時間とともに価値が増していきます。７．複数部門で推進できるフジィが「絶滅危惧種を、獲らずに育てる技術」の象徴になることで、広報活動だけでなく、統合報告書・サステナビリティ報告・SDGs（目標14「海の豊かさを守ろう」）の文脈でも語れるようになります。予算と推進主体を一部門に依存しない企画になります。８．来年度の計画として、すぐに動かせる2027年という明確な節目があるため、「いつか実施する案」ではなく「2027年度に実施する計画」として検討できます。第1期の制作物（ちびフジィ、スタンプ128種、体験版）は本エントリーにすべて添付済みです。</w:t>
@@ -1052,104 +1119,117 @@
               <w:jc w:val="left"/>
               <w:rPr>
                 <w:rFonts w:ascii="游明朝" w:eastAsia="游明朝" w:hAnsi="游明朝"/>
-                <w:szCs w:val="21"/>
-              </w:rPr>
-            </w:pPr>
-          </w:p>
-          <w:p>
-            <w:pPr>
-              <w:jc w:val="left"/>
-              <w:rPr>
-                <w:rFonts w:ascii="游明朝" w:eastAsia="游明朝" w:hAnsi="游明朝"/>
-                <w:szCs w:val="21"/>
-              </w:rPr>
-            </w:pPr>
-            <w:r>
-              <w:rPr>
-                <w:rFonts w:ascii="游明朝" w:eastAsia="游明朝" w:hAnsi="游明朝"/>
-                <w:szCs w:val="21"/>
-              </w:rPr>
-              <w:t>■ 2027 年の、ある一日 ―― 効果は視聴率ではなく、こういう一日として現れます</w:t>
-            </w:r>
-          </w:p>
-          <w:p>
-            <w:pPr>
-              <w:jc w:val="left"/>
-              <w:rPr>
-                <w:rFonts w:ascii="游明朝" w:eastAsia="游明朝" w:hAnsi="游明朝"/>
-                <w:szCs w:val="21"/>
-              </w:rPr>
-            </w:pPr>
-            <w:r>
-              <w:rPr>
-                <w:rFonts w:ascii="游明朝" w:eastAsia="游明朝" w:hAnsi="游明朝"/>
-                <w:szCs w:val="21"/>
-              </w:rPr>
-              <w:t>【朝】常陸太田・里美養魚場、給餌の 7 時。水面が一斉に沸き立つ 20 秒を飼育員が撮り、ちびフジィの声で「今日もごはん。1 万匹分」と投稿します。114 人だったフォロワーは毎週この光景を見てきました。県水産課の担当者もその一人で、庁内に転送します。</w:t>
-            </w:r>
-          </w:p>
-          <w:p>
-            <w:pPr>
-              <w:jc w:val="left"/>
-              <w:rPr>
-                <w:rFonts w:ascii="游明朝" w:eastAsia="游明朝" w:hAnsi="游明朝"/>
-                <w:szCs w:val="21"/>
-              </w:rPr>
-            </w:pPr>
-            <w:r>
-              <w:rPr>
-                <w:rFonts w:ascii="游明朝" w:eastAsia="游明朝" w:hAnsi="游明朝"/>
-                <w:szCs w:val="21"/>
-              </w:rPr>
-              <w:t>【昼】大阪の高校、社会科の教室。配布資料の QR コードから 90 秒後、40 台のスマートフォンに成魚が泳いでいます。「この会社なに？」「バルブの会社。この魚を世界で初めて卵から育てた」。その一人が三年後の採用説明会でこの日を話します。</w:t>
-            </w:r>
-          </w:p>
-          <w:p>
-            <w:pPr>
-              <w:jc w:val="left"/>
-              <w:rPr>
-                <w:rFonts w:ascii="游明朝" w:eastAsia="游明朝" w:hAnsi="游明朝"/>
-                <w:szCs w:val="21"/>
-              </w:rPr>
-            </w:pPr>
-            <w:r>
-              <w:rPr>
-                <w:rFonts w:ascii="游明朝" w:eastAsia="游明朝" w:hAnsi="游明朝"/>
-                <w:szCs w:val="21"/>
-              </w:rPr>
-              <w:t>【夕】友だちのグループチャット。「サメじゃないです」のスタンプが送られ、「チョウザメ。絶滅しそうな魚を獲らずに増やせるようにした会社がいる」と会話が始まります。フジキンはこの会話に一円も払っていません。</w:t>
-            </w:r>
-          </w:p>
-          <w:p>
-            <w:pPr>
-              <w:jc w:val="left"/>
-              <w:rPr>
-                <w:rFonts w:ascii="游明朝" w:eastAsia="游明朝" w:hAnsi="游明朝"/>
-                <w:szCs w:val="21"/>
-              </w:rPr>
-            </w:pPr>
-            <w:r>
-              <w:rPr>
-                <w:rFonts w:ascii="游明朝" w:eastAsia="游明朝" w:hAnsi="游明朝"/>
-                <w:szCs w:val="21"/>
-              </w:rPr>
-              <w:t>【夜】どこかの家の食卓。お歳暮の国産キャビア缶に小さな銀色の魚。「里美のやつだ。今度見に行こう」。缶の生産者はフジキンから稚魚を買う会社で、キャラクターの使用料はかかっていません。</w:t>
-            </w:r>
-          </w:p>
-          <w:p>
-            <w:pPr>
-              <w:jc w:val="left"/>
-              <w:rPr>
-                <w:rFonts w:ascii="游明朝" w:eastAsia="游明朝" w:hAnsi="游明朝"/>
-                <w:szCs w:val="21"/>
-              </w:rPr>
-            </w:pPr>
-            <w:r>
-              <w:rPr>
-                <w:rFonts w:ascii="游明朝" w:eastAsia="游明朝" w:hAnsi="游明朝"/>
-                <w:szCs w:val="21"/>
-              </w:rPr>
-              <w:t>四つの場面に共通するのは、誰かがフジキンの話を自分の言葉でしていることです。それが「覚えられる会社」と「語られる会社」の差です。</w:t>
+                <w:sz w:val="17"/>
+                <w:szCs w:val="21"/>
+              </w:rPr>
+            </w:pPr>
+          </w:p>
+          <w:p>
+            <w:pPr>
+              <w:jc w:val="left"/>
+              <w:rPr>
+                <w:rFonts w:ascii="游明朝" w:eastAsia="游明朝" w:hAnsi="游明朝"/>
+                <w:sz w:val="17"/>
+                <w:szCs w:val="21"/>
+              </w:rPr>
+            </w:pPr>
+            <w:r>
+              <w:rPr>
+                <w:rFonts w:ascii="游明朝" w:eastAsia="游明朝" w:hAnsi="游明朝"/>
+                <w:sz w:val="17"/>
+                <w:szCs w:val="21"/>
+              </w:rPr>
+              <w:t>■ 2027 年の、ある一日</w:t>
+            </w:r>
+          </w:p>
+          <w:p>
+            <w:pPr>
+              <w:jc w:val="left"/>
+              <w:rPr>
+                <w:rFonts w:ascii="游明朝" w:eastAsia="游明朝" w:hAnsi="游明朝"/>
+                <w:sz w:val="17"/>
+                <w:szCs w:val="21"/>
+              </w:rPr>
+            </w:pPr>
+            <w:r>
+              <w:rPr>
+                <w:rFonts w:ascii="游明朝" w:eastAsia="游明朝" w:hAnsi="游明朝"/>
+                <w:sz w:val="17"/>
+                <w:szCs w:val="21"/>
+              </w:rPr>
+              <w:t>【朝】里美養魚場、給餌の 7 時。水面が沸き立つ 20 秒を飼育員が撮り、ちびフジィの声で「今日もごはん。1 万匹分」と投稿します。県水産課の担当者が、庁内に転送します。</w:t>
+            </w:r>
+          </w:p>
+          <w:p>
+            <w:pPr>
+              <w:jc w:val="left"/>
+              <w:rPr>
+                <w:rFonts w:ascii="游明朝" w:eastAsia="游明朝" w:hAnsi="游明朝"/>
+                <w:sz w:val="17"/>
+                <w:szCs w:val="21"/>
+              </w:rPr>
+            </w:pPr>
+            <w:r>
+              <w:rPr>
+                <w:rFonts w:ascii="游明朝" w:eastAsia="游明朝" w:hAnsi="游明朝"/>
+                <w:sz w:val="17"/>
+                <w:szCs w:val="21"/>
+              </w:rPr>
+              <w:t>【昼】大阪の高校の教室。配布資料の QR コードから 90 秒後、40 台のスマートフォンに成魚が泳いでいます。「バルブの会社。この魚を世界で初めて卵から育てた」。</w:t>
+            </w:r>
+          </w:p>
+          <w:p>
+            <w:pPr>
+              <w:jc w:val="left"/>
+              <w:rPr>
+                <w:rFonts w:ascii="游明朝" w:eastAsia="游明朝" w:hAnsi="游明朝"/>
+                <w:sz w:val="17"/>
+                <w:szCs w:val="21"/>
+              </w:rPr>
+            </w:pPr>
+            <w:r>
+              <w:rPr>
+                <w:rFonts w:ascii="游明朝" w:eastAsia="游明朝" w:hAnsi="游明朝"/>
+                <w:sz w:val="17"/>
+                <w:szCs w:val="21"/>
+              </w:rPr>
+              <w:t>【夕】友だちのグループチャット。「サメじゃないです」のスタンプから会話が始まります。フジキンは一円も払っていません。</w:t>
+            </w:r>
+          </w:p>
+          <w:p>
+            <w:pPr>
+              <w:jc w:val="left"/>
+              <w:rPr>
+                <w:rFonts w:ascii="游明朝" w:eastAsia="游明朝" w:hAnsi="游明朝"/>
+                <w:sz w:val="17"/>
+                <w:szCs w:val="21"/>
+              </w:rPr>
+            </w:pPr>
+            <w:r>
+              <w:rPr>
+                <w:rFonts w:ascii="游明朝" w:eastAsia="游明朝" w:hAnsi="游明朝"/>
+                <w:sz w:val="17"/>
+                <w:szCs w:val="21"/>
+              </w:rPr>
+              <w:t>【夜】どこかの家の食卓。お歳暮の国産キャビア缶に銀色の小さな魚。「里美のやつだ。今度見に行こう」。缶の生産者は、フジキンから稚魚を買う会社です。</w:t>
+            </w:r>
+          </w:p>
+          <w:p>
+            <w:pPr>
+              <w:jc w:val="left"/>
+              <w:rPr>
+                <w:rFonts w:ascii="游明朝" w:eastAsia="游明朝" w:hAnsi="游明朝"/>
+                <w:sz w:val="17"/>
+                <w:szCs w:val="21"/>
+              </w:rPr>
+            </w:pPr>
+            <w:r>
+              <w:rPr>
+                <w:rFonts w:ascii="游明朝" w:eastAsia="游明朝" w:hAnsi="游明朝"/>
+                <w:sz w:val="17"/>
+                <w:szCs w:val="21"/>
+              </w:rPr>
+              <w:t>共通するのは、誰かがフジキンの話を自分の言葉でしていること。それが「覚えられる会社」と「語られる会社」の差です。</w:t>
             </w:r>
           </w:p>
           <w:p>
@@ -1157,24 +1237,27 @@
               <w:jc w:val="left"/>
               <w:rPr>
                 <w:rFonts w:ascii="游明朝" w:eastAsia="游明朝" w:hAnsi="游明朝" w:hint="eastAsia"/>
-                <w:szCs w:val="21"/>
-              </w:rPr>
-            </w:pPr>
-          </w:p>
-          <w:p>
-            <w:pPr>
-              <w:jc w:val="left"/>
-              <w:rPr>
-                <w:rFonts w:ascii="游明朝" w:eastAsia="游明朝" w:hAnsi="游明朝"/>
-                <w:szCs w:val="21"/>
-              </w:rPr>
-            </w:pPr>
-          </w:p>
-          <w:p>
-            <w:pPr>
-              <w:jc w:val="left"/>
-              <w:rPr>
-                <w:rFonts w:ascii="游明朝" w:eastAsia="游明朝" w:hAnsi="游明朝"/>
+                <w:sz w:val="17"/>
+                <w:szCs w:val="21"/>
+              </w:rPr>
+            </w:pPr>
+          </w:p>
+          <w:p>
+            <w:pPr>
+              <w:jc w:val="left"/>
+              <w:rPr>
+                <w:rFonts w:ascii="游明朝" w:eastAsia="游明朝" w:hAnsi="游明朝"/>
+                <w:sz w:val="17"/>
+                <w:szCs w:val="21"/>
+              </w:rPr>
+            </w:pPr>
+          </w:p>
+          <w:p>
+            <w:pPr>
+              <w:jc w:val="left"/>
+              <w:rPr>
+                <w:rFonts w:ascii="游明朝" w:eastAsia="游明朝" w:hAnsi="游明朝"/>
+                <w:sz w:val="17"/>
                 <w:szCs w:val="21"/>
               </w:rPr>
             </w:pPr>
@@ -1184,6 +1267,7 @@
               <w:jc w:val="left"/>
               <w:rPr>
                 <w:rFonts w:ascii="游明朝" w:eastAsia="游明朝" w:hAnsi="游明朝" w:hint="eastAsia"/>
+                <w:sz w:val="17"/>
                 <w:szCs w:val="21"/>
               </w:rPr>
             </w:pPr>
@@ -1194,6 +1278,7 @@
               <w:rPr>
                 <w:rFonts w:ascii="游明朝" w:eastAsia="游明朝" w:hAnsi="游明朝" w:hint="eastAsia"/>
                 <w:color w:val="FF0000"/>
+                <w:sz w:val="17"/>
                 <w:szCs w:val="21"/>
               </w:rPr>
             </w:pPr>
@@ -1205,6 +1290,7 @@
       <w:pPr>
         <w:rPr>
           <w:rFonts w:ascii="游明朝" w:eastAsia="游明朝" w:hAnsi="游明朝" w:hint="eastAsia"/>
+          <w:sz w:val="17"/>
           <w:szCs w:val="21"/>
         </w:rPr>
       </w:pPr>

</xml_diff>

<commit_message>
Chapter breaks you can feel, and the deck and entry sheet carry all thirteen ideas
Each chapter now opens on a full dark screen with its number behind the
title, so the page reads as five acts rather than one scroll. The deck
gains five slides for the new ideas and its overview lists eleven. The
entry sheet's idea list is tightened to nine items, with the open day,
the letter and Sturgeon Day under one heading, and still fits on three
pages.

Co-Authored-By: Claude Fable 5.1 <noreply@anthropic.com>
</commit_message>
<xml_diff>
--- a/Fujie_Creative/05_submission/エントリーシート_記入済.docx
+++ b/Fujie_Creative/05_submission/エントリーシート_記入済.docx
@@ -114,7 +114,7 @@
           <w:rFonts w:ascii="ＭＳ 明朝" w:hAnsi="ＭＳ 明朝"/>
           <w:noProof/>
         </w:rPr>
-        <w:pict w14:anchorId="1A16B7FD">
+        <w:pict w14:anchorId="2A2553CA">
           <v:shapetype id="_x0000_t75" coordsize="21600,21600" o:spt="75" o:preferrelative="t" path="m@4@5l@4@11@9@11@9@5xe" filled="f" stroked="f">
             <v:stroke joinstyle="miter"/>
             <v:formulas>
@@ -637,7 +637,7 @@
                 <w:sz w:val="17"/>
                 <w:szCs w:val="21"/>
               </w:rPr>
-              <w:t>現行マニュアルの規定は一切変更しません。従来のフジィは企業シンボルとして厳格に保護したまま、表情と親しみやすさを担う「ちびフジィ」を公式に追加します。シンボルは、笑うことも、抱きしめられることも、ファンに描かれることもできません。フジィが有名になるために不足しているのは、この一点だと考えます。</w:t>
+              <w:t>現行マニュアルは一切変更せず、公式フジィは企業シンボルとして守ったまま、表情と親しみを担う「ちびフジィ」を公式に追加します。シンボルは笑うことも抱きしめられることもできません。有名になるために不足しているのは、この一点です。</w:t>
             </w:r>
           </w:p>
           <w:p>
@@ -674,7 +674,7 @@
                 <w:sz w:val="17"/>
                 <w:szCs w:val="21"/>
               </w:rPr>
-              <w:t>公式アカウントの友だち追加を条件とした無料配布は、日本において最も費用対効果の高い認知獲得手段です。スタンプは「友人が」「私的な会話の中で」「自発的に」送るため、広告では到達できない場所に届きます。本エントリーでは、実際に使用可能な128種（日本語64種・英語64種）を制作し、一点ずつ切り出した状態で別資料に添付しています。</w:t>
+              <w:t>友だち追加を条件とした無料配布は、日本で最も費用対効果の高い認知獲得手段です。スタンプは「友人が」「私的な会話で」「自発的に」送るため、広告では届かない場所に届きます。128種（日本語64・英語64）は制作済みで、別資料に添付しています。</w:t>
             </w:r>
           </w:p>
           <w:p>
@@ -710,7 +710,7 @@
                 <w:sz w:val="17"/>
                 <w:szCs w:val="21"/>
               </w:rPr>
-              <w:t>公式Instagramは現在114フォロワー。これは弱点ではなく、余白です。1万尾の給餌風景、ふ化の瞬間、夜明けの養魚場 ―― 誰も見たことのない映像を、フジキンだけが持っています。</w:t>
+              <w:t>公式Instagramは現在114フォロワー。弱点ではなく余白です。1万尾の給餌、ふ化の瞬間、夜明けの養魚場 ―― 誰も見たことのない映像を、フジキンだけが持っています。</w:t>
             </w:r>
           </w:p>
           <w:p>
@@ -746,43 +746,43 @@
                 <w:sz w:val="17"/>
                 <w:szCs w:val="21"/>
               </w:rPr>
-              <w:t>フジキンはチョウザメの稚魚を全国の養殖業者へ販売しています。その取引先に無償開放すれば、日本中の国産キャビア生産者のパッケージが、そのままフジキンの広告になります。追加費用はかからず、既存の取引網だけで成立します。</w:t>
-            </w:r>
-          </w:p>
-          <w:p>
-            <w:pPr>
-              <w:jc w:val="left"/>
-              <w:rPr>
-                <w:rFonts w:ascii="游明朝" w:eastAsia="游明朝" w:hAnsi="游明朝"/>
-                <w:sz w:val="17"/>
-                <w:szCs w:val="21"/>
-              </w:rPr>
-            </w:pPr>
-            <w:r>
-              <w:rPr>
-                <w:rFonts w:ascii="游明朝" w:eastAsia="游明朝" w:hAnsi="游明朝"/>
-                <w:sz w:val="17"/>
-                <w:szCs w:val="21"/>
-              </w:rPr>
-              <w:t>⑤「会いに行けるマスコット」にする</w:t>
-            </w:r>
-          </w:p>
-          <w:p>
-            <w:pPr>
-              <w:jc w:val="left"/>
-              <w:rPr>
-                <w:rFonts w:ascii="游明朝" w:eastAsia="游明朝" w:hAnsi="游明朝"/>
-                <w:sz w:val="17"/>
-                <w:szCs w:val="21"/>
-              </w:rPr>
-            </w:pPr>
-            <w:r>
-              <w:rPr>
-                <w:rFonts w:ascii="游明朝" w:eastAsia="游明朝" w:hAnsi="游明朝"/>
-                <w:sz w:val="17"/>
-                <w:szCs w:val="21"/>
-              </w:rPr>
-              <w:t>里美養魚場の限定公開。日本で唯一、餌やりができる企業マスコットになります。茨城県は「霞ヶ浦キャビア」で国内一の産地を目指しており、協力相手として利害が完全に一致します。</w:t>
+              <w:t>フジキンは稚魚を全国の養殖業者へ販売しています。その取引先に無償開放すれば、日本中の国産キャビアのパッケージがそのまま広告になります。追加費用はかからず、既存の取引網だけで成立します。</w:t>
+            </w:r>
+          </w:p>
+          <w:p>
+            <w:pPr>
+              <w:jc w:val="left"/>
+              <w:rPr>
+                <w:rFonts w:ascii="游明朝" w:eastAsia="游明朝" w:hAnsi="游明朝"/>
+                <w:sz w:val="17"/>
+                <w:szCs w:val="21"/>
+              </w:rPr>
+            </w:pPr>
+            <w:r>
+              <w:rPr>
+                <w:rFonts w:ascii="游明朝" w:eastAsia="游明朝" w:hAnsi="游明朝"/>
+                <w:sz w:val="17"/>
+                <w:szCs w:val="21"/>
+              </w:rPr>
+              <w:t>⑤「会いに行けるマスコット」にする ―― 年に一度の公開日</w:t>
+            </w:r>
+          </w:p>
+          <w:p>
+            <w:pPr>
+              <w:jc w:val="left"/>
+              <w:rPr>
+                <w:rFonts w:ascii="游明朝" w:eastAsia="游明朝" w:hAnsi="游明朝"/>
+                <w:sz w:val="17"/>
+                <w:szCs w:val="21"/>
+              </w:rPr>
+            </w:pPr>
+            <w:r>
+              <w:rPr>
+                <w:rFonts w:ascii="游明朝" w:eastAsia="游明朝" w:hAnsi="游明朝"/>
+                <w:sz w:val="17"/>
+                <w:szCs w:val="21"/>
+              </w:rPr>
+              <w:t>里美養魚場（常陸太田市）を年に一度、地元の40家族に抽選で公開します。午前は、その年に卵からかえった「2027年組」への手紙。封をして、創業100周年の2030年に開封します（魚は年ごとの組で育つため、一尾ずつ追う必要はありません）。午後は、日本で初めてこの魚からつくられたキャビアを小さな匙で一口。この日を「チョウザメの日」として日本記念日協会に登録し、フジィの誕生日と重ねます。全種が絶滅危惧種のこの魚に、まだ記念日はありません。</w:t>
             </w:r>
           </w:p>
           <w:p>
@@ -818,74 +818,240 @@
                 <w:sz w:val="17"/>
                 <w:szCs w:val="21"/>
               </w:rPr>
-              <w:t>ソ連視察、ボルガ川の船上で初めて口にしたキャビア、生残率5％の初年度、そして世界初へ。ロケ地はすべて自社保有であり、制作費以外の追加投資を必要としません。⑦「サメじゃないです。」を入口の一言にするチョウザメは「蝶のサメ」と書くため、ほぼ全員が最初にサメだと誤解します。フジキンのキャビアサイトにも「サメとの違い」というページがあるほどです。この誤解を直すのではなく、入口として使います。「サメじゃないです。」に続けて「サメより、ずっと少ないんです。」と言えば、二行でチョウザメの正体と、この魚がおかれた状況が同時に伝わります。キャラクター最大の弱点（サメに見えること）が、そのまま最大の入口になります。なお、この一言を発するのは「ちびフジィ」であり、公式フジィに文字を重ねることはしません（マニュアル第7条）。実施時期について。2027年は、1987年の挑戦開始から40年、2002年の初出荷から25年にあたります。本コンテストの結果発表は2026年12月であり、本企画はそのまま2027年度の計画に乗せることができます。2028年には完全養殖から30年、そして2030年には創業100周年。創業100周年を、フジィが有名になった状態で迎えることを目標とします。</w:t>
-            </w:r>
-          </w:p>
-          <w:p>
-            <w:pPr>
-              <w:jc w:val="left"/>
+              <w:t>ボルガ川の船上で初めて口にしたキャビア、生残率5％の初年度、そして世界初へ。ロケ地はすべて自社保有です。</w:t>
+            </w:r>
+          </w:p>
+          <w:p>
+            <w:pPr>
+              <w:jc w:val="left"/>
+              <w:rPr>
+                <w:rFonts w:ascii="游明朝" w:eastAsia="游明朝" w:hAnsi="游明朝"/>
+                <w:sz w:val="17"/>
+                <w:szCs w:val="21"/>
+              </w:rPr>
+            </w:pPr>
+            <w:r>
+              <w:rPr>
+                <w:rFonts w:ascii="游明朝" w:eastAsia="游明朝" w:hAnsi="游明朝"/>
+                <w:sz w:val="17"/>
+                <w:szCs w:val="21"/>
+              </w:rPr>
+              <w:t>⑦「サメじゃないです。」を入口の一言にする</w:t>
+            </w:r>
+          </w:p>
+          <w:p>
+            <w:pPr>
+              <w:jc w:val="left"/>
+              <w:rPr>
+                <w:rFonts w:ascii="游明朝" w:eastAsia="游明朝" w:hAnsi="游明朝"/>
+                <w:sz w:val="17"/>
+                <w:szCs w:val="21"/>
+              </w:rPr>
+            </w:pPr>
+            <w:r>
+              <w:rPr>
+                <w:rFonts w:ascii="游明朝" w:eastAsia="游明朝" w:hAnsi="游明朝"/>
+                <w:sz w:val="17"/>
+                <w:szCs w:val="21"/>
+              </w:rPr>
+              <w:t>チョウザメは「蝶のサメ」と書くため、ほぼ全員が最初にサメだと誤解します。直すのではなく入口に使い、「サメより、ずっと少ないんです。」と続ければ、二行で正体と状況が伝わります。この一言を発するのはちびフジィで、公式フジィに文字は重ねません（第7条）。</w:t>
+            </w:r>
+          </w:p>
+          <w:p>
+            <w:pPr>
+              <w:jc w:val="left"/>
+              <w:rPr>
+                <w:rFonts w:ascii="游明朝" w:eastAsia="游明朝" w:hAnsi="游明朝"/>
+                <w:sz w:val="17"/>
+                <w:szCs w:val="21"/>
+              </w:rPr>
+            </w:pPr>
+            <w:r>
+              <w:rPr>
+                <w:rFonts w:ascii="游明朝" w:eastAsia="游明朝" w:hAnsi="游明朝"/>
+                <w:sz w:val="17"/>
+                <w:szCs w:val="21"/>
+              </w:rPr>
+              <w:t>⑧水族館のサメの隣に、本物のフジィを</w:t>
+            </w:r>
+          </w:p>
+          <w:p>
+            <w:pPr>
+              <w:jc w:val="left"/>
+              <w:rPr>
+                <w:rFonts w:ascii="游明朝" w:eastAsia="游明朝" w:hAnsi="游明朝"/>
+                <w:sz w:val="17"/>
+                <w:szCs w:val="21"/>
+              </w:rPr>
+            </w:pPr>
+            <w:r>
+              <w:rPr>
+                <w:rFonts w:ascii="游明朝" w:eastAsia="游明朝" w:hAnsi="游明朝"/>
+                <w:sz w:val="17"/>
+                <w:szCs w:val="21"/>
+              </w:rPr>
+              <w:t>サメの展示で知られる大洗のアクアワールドに小さな水槽を置き、里美のフジィを泳がせ、「サメじゃないです」のパネルを添えます。誰もがサメだと思う魚を本物のサメの隣に。水族館の判断を前提とした提案です。</w:t>
+            </w:r>
+          </w:p>
+          <w:p>
+            <w:pPr>
+              <w:jc w:val="left"/>
+              <w:rPr>
+                <w:rFonts w:ascii="游明朝" w:eastAsia="游明朝" w:hAnsi="游明朝"/>
+                <w:sz w:val="17"/>
+                <w:szCs w:val="21"/>
+              </w:rPr>
+            </w:pPr>
+            <w:r>
+              <w:rPr>
+                <w:rFonts w:ascii="游明朝" w:eastAsia="游明朝" w:hAnsi="游明朝"/>
+                <w:sz w:val="17"/>
+                <w:szCs w:val="21"/>
+              </w:rPr>
+              <w:t>⑨常陸太田市に、フジィのマンホール</w:t>
+            </w:r>
+          </w:p>
+          <w:p>
+            <w:pPr>
+              <w:jc w:val="left"/>
+              <w:rPr>
+                <w:rFonts w:ascii="游明朝" w:eastAsia="游明朝" w:hAnsi="游明朝"/>
+                <w:sz w:val="17"/>
+                <w:szCs w:val="21"/>
+              </w:rPr>
+            </w:pPr>
+            <w:r>
+              <w:rPr>
+                <w:rFonts w:ascii="游明朝" w:eastAsia="游明朝" w:hAnsi="游明朝"/>
+                <w:sz w:val="17"/>
+                <w:szCs w:val="21"/>
+              </w:rPr>
+              <w:t>駅前・市役所・養魚場の門に3</w:t>
+            </w:r>
+            <w:r>
               <w:rPr>
                 <w:rFonts w:ascii="游明朝" w:eastAsia="游明朝" w:hAnsi="游明朝" w:hint="eastAsia"/>
                 <w:sz w:val="17"/>
                 <w:szCs w:val="21"/>
               </w:rPr>
-            </w:pPr>
-          </w:p>
-          <w:p>
-            <w:pPr>
-              <w:jc w:val="left"/>
-              <w:rPr>
-                <w:rFonts w:ascii="游明朝" w:eastAsia="游明朝" w:hAnsi="游明朝"/>
-                <w:sz w:val="17"/>
-                <w:szCs w:val="21"/>
-              </w:rPr>
-            </w:pPr>
-          </w:p>
-          <w:p>
-            <w:pPr>
-              <w:jc w:val="left"/>
-              <w:rPr>
-                <w:rFonts w:ascii="游明朝" w:eastAsia="游明朝" w:hAnsi="游明朝"/>
-                <w:sz w:val="17"/>
-                <w:szCs w:val="21"/>
-              </w:rPr>
-            </w:pPr>
-          </w:p>
-          <w:p>
-            <w:pPr>
-              <w:jc w:val="left"/>
-              <w:rPr>
-                <w:rFonts w:ascii="游明朝" w:eastAsia="游明朝" w:hAnsi="游明朝"/>
-                <w:sz w:val="17"/>
-                <w:szCs w:val="21"/>
-              </w:rPr>
-            </w:pPr>
-          </w:p>
-          <w:p>
-            <w:pPr>
-              <w:jc w:val="left"/>
+              <w:t>〜</w:t>
+            </w:r>
+            <w:r>
+              <w:rPr>
+                <w:rFonts w:ascii="游明朝" w:eastAsia="游明朝" w:hAnsi="游明朝"/>
+                <w:sz w:val="17"/>
+                <w:szCs w:val="21"/>
+              </w:rPr>
+              <w:t>5枚。カラーの蓋には公式フジィを原画どおりの色で（色の再現はマニュアル管理者の確認を条件に）、別の蓋にはちびフジィを。地元紙が必ず報じ、一度置けば何十年も残ります。</w:t>
+            </w:r>
+          </w:p>
+          <w:p>
+            <w:pPr>
+              <w:jc w:val="left"/>
+              <w:rPr>
+                <w:rFonts w:ascii="游明朝" w:eastAsia="游明朝" w:hAnsi="游明朝"/>
+                <w:sz w:val="17"/>
+                <w:szCs w:val="21"/>
+              </w:rPr>
+            </w:pPr>
+            <w:r>
               <w:rPr>
                 <w:rFonts w:ascii="游明朝" w:eastAsia="游明朝" w:hAnsi="游明朝" w:hint="eastAsia"/>
                 <w:sz w:val="17"/>
                 <w:szCs w:val="21"/>
               </w:rPr>
-            </w:pPr>
-          </w:p>
-          <w:p>
-            <w:pPr>
-              <w:jc w:val="left"/>
-              <w:rPr>
-                <w:rFonts w:ascii="游明朝" w:eastAsia="游明朝" w:hAnsi="游明朝"/>
-                <w:sz w:val="17"/>
-                <w:szCs w:val="21"/>
-              </w:rPr>
-            </w:pPr>
+              <w:t>実施時期について。</w:t>
+            </w:r>
+            <w:r>
+              <w:rPr>
+                <w:rFonts w:ascii="游明朝" w:eastAsia="游明朝" w:hAnsi="游明朝"/>
+                <w:sz w:val="17"/>
+                <w:szCs w:val="21"/>
+              </w:rPr>
+              <w:t>2027年は、1987年の挑戦開始から40年、2002年の初出荷から25年にあたります。本コンテストの</w:t>
+            </w:r>
             <w:r>
               <w:rPr>
                 <w:rFonts w:ascii="游明朝" w:eastAsia="游明朝" w:hAnsi="游明朝" w:hint="eastAsia"/>
                 <w:sz w:val="17"/>
                 <w:szCs w:val="21"/>
               </w:rPr>
+              <w:t>結果発表は</w:t>
+            </w:r>
+            <w:r>
+              <w:rPr>
+                <w:rFonts w:ascii="游明朝" w:eastAsia="游明朝" w:hAnsi="游明朝"/>
+                <w:sz w:val="17"/>
+                <w:szCs w:val="21"/>
+              </w:rPr>
+              <w:t>2026年12月であり、本企画はそのまま2027年度の計画に乗せることができます。2028年には完全養殖から30年、そして2030年には創業100周年。創業100周年を、フジィが有名になった状態で迎えることを目標とします。</w:t>
+            </w:r>
+          </w:p>
+          <w:p>
+            <w:pPr>
+              <w:jc w:val="left"/>
+              <w:rPr>
+                <w:rFonts w:ascii="游明朝" w:eastAsia="游明朝" w:hAnsi="游明朝" w:hint="eastAsia"/>
+                <w:sz w:val="17"/>
+                <w:szCs w:val="21"/>
+              </w:rPr>
+            </w:pPr>
+          </w:p>
+          <w:p>
+            <w:pPr>
+              <w:jc w:val="left"/>
+              <w:rPr>
+                <w:rFonts w:ascii="游明朝" w:eastAsia="游明朝" w:hAnsi="游明朝"/>
+                <w:sz w:val="17"/>
+                <w:szCs w:val="21"/>
+              </w:rPr>
+            </w:pPr>
+          </w:p>
+          <w:p>
+            <w:pPr>
+              <w:jc w:val="left"/>
+              <w:rPr>
+                <w:rFonts w:ascii="游明朝" w:eastAsia="游明朝" w:hAnsi="游明朝"/>
+                <w:sz w:val="17"/>
+                <w:szCs w:val="21"/>
+              </w:rPr>
+            </w:pPr>
+          </w:p>
+          <w:p>
+            <w:pPr>
+              <w:jc w:val="left"/>
+              <w:rPr>
+                <w:rFonts w:ascii="游明朝" w:eastAsia="游明朝" w:hAnsi="游明朝"/>
+                <w:sz w:val="17"/>
+                <w:szCs w:val="21"/>
+              </w:rPr>
+            </w:pPr>
+          </w:p>
+          <w:p>
+            <w:pPr>
+              <w:jc w:val="left"/>
+              <w:rPr>
+                <w:rFonts w:ascii="游明朝" w:eastAsia="游明朝" w:hAnsi="游明朝" w:hint="eastAsia"/>
+                <w:sz w:val="17"/>
+                <w:szCs w:val="21"/>
+              </w:rPr>
+            </w:pPr>
+          </w:p>
+          <w:p>
+            <w:pPr>
+              <w:jc w:val="left"/>
+              <w:rPr>
+                <w:rFonts w:ascii="游明朝" w:eastAsia="游明朝" w:hAnsi="游明朝"/>
+                <w:sz w:val="17"/>
+                <w:szCs w:val="21"/>
+              </w:rPr>
+            </w:pPr>
+            <w:r>
+              <w:rPr>
+                <w:rFonts w:ascii="游明朝" w:eastAsia="游明朝" w:hAnsi="游明朝" w:hint="eastAsia"/>
+                <w:sz w:val="17"/>
+                <w:szCs w:val="21"/>
+              </w:rPr>
               <w:t>期待される</w:t>
             </w:r>
             <w:r>
@@ -930,7 +1096,16 @@
                 <w:sz w:val="17"/>
                 <w:szCs w:val="21"/>
               </w:rPr>
-              <w:t>グッズは配れば終わりますが、物語は人が人に話します。「バルブの会社が日本のキャビアをつくった」という一文は、聞いた人が翌日 誰かに話したくなる強度を持っています。広告費をかけずに伝播する、唯一の資産です。</w:t>
+              <w:t>「バルブの会社が日本のキャビアをつくった」という一文は、聞いた人が翌日 誰かに話したくなる強度を持っています。</w:t>
+            </w:r>
+            <w:r>
+              <w:rPr>
+                <w:rFonts w:ascii="游明朝" w:eastAsia="游明朝" w:hAnsi="游明朝"/>
+                <w:sz w:val="17"/>
+                <w:szCs w:val="21"/>
+              </w:rPr>
+              <w:lastRenderedPageBreak/>
+              <w:t>広告費をかけずに伝播する、唯一の資産です。</w:t>
             </w:r>
           </w:p>
           <w:p>
@@ -966,7 +1141,7 @@
                 <w:sz w:val="17"/>
                 <w:szCs w:val="21"/>
               </w:rPr>
-              <w:t>LINEスタンプは、送信されるかぎり露出が続きます。一度の制作費で、個人間の会話という最も信頼された場所に、繰り返しフジィが現れ続けます。</w:t>
+              <w:t>LINEスタンプは、送信されるかぎり露出が続きます。一度の制作費で、個人間の会話に繰り返し現れます。</w:t>
             </w:r>
           </w:p>
           <w:p>
@@ -1002,25 +1177,24 @@
                 <w:sz w:val="17"/>
                 <w:szCs w:val="21"/>
               </w:rPr>
-              <w:t>稚魚取引先への無償開放により、フジキンが直接リーチできない一般消費者の食卓にフジィが届きます。BtoB企業がBtoCに到達する、現実的で低コストな経路です。</w:t>
-            </w:r>
-          </w:p>
-          <w:p>
-            <w:pPr>
-              <w:jc w:val="left"/>
-              <w:rPr>
-                <w:rFonts w:ascii="游明朝" w:eastAsia="游明朝" w:hAnsi="游明朝"/>
-                <w:sz w:val="17"/>
-                <w:szCs w:val="21"/>
-              </w:rPr>
-            </w:pPr>
-            <w:r>
-              <w:rPr>
-                <w:rFonts w:ascii="游明朝" w:eastAsia="游明朝" w:hAnsi="游明朝"/>
-                <w:sz w:val="17"/>
-                <w:szCs w:val="21"/>
-              </w:rPr>
-              <w:lastRenderedPageBreak/>
+              <w:t>稚魚取引先への無償開放により、フジキンが直接リーチできない一般消費者の食卓にフジィが届きます。</w:t>
+            </w:r>
+          </w:p>
+          <w:p>
+            <w:pPr>
+              <w:jc w:val="left"/>
+              <w:rPr>
+                <w:rFonts w:ascii="游明朝" w:eastAsia="游明朝" w:hAnsi="游明朝"/>
+                <w:sz w:val="17"/>
+                <w:szCs w:val="21"/>
+              </w:rPr>
+            </w:pPr>
+            <w:r>
+              <w:rPr>
+                <w:rFonts w:ascii="游明朝" w:eastAsia="游明朝" w:hAnsi="游明朝"/>
+                <w:sz w:val="17"/>
+                <w:szCs w:val="21"/>
+              </w:rPr>
               <w:t>４．採用広報への波及</w:t>
             </w:r>
           </w:p>
@@ -1039,7 +1213,7 @@
                 <w:sz w:val="17"/>
                 <w:szCs w:val="21"/>
               </w:rPr>
-              <w:t>生残率5％から世界初に至った11年間は、企業ポリシー「極限への挑戦」そのものです。説明する言葉ではなく実話として語れるため、学生が最も反応する種類の物語になります。</w:t>
+              <w:t>生残率5％から世界初に至った11年間は、企業ポリシー「極限への挑戦」そのものです。実話として語れるため、学生が最も反応する物語です。</w:t>
             </w:r>
           </w:p>
           <w:p>
@@ -1111,7 +1285,7 @@
                 <w:sz w:val="17"/>
                 <w:szCs w:val="21"/>
               </w:rPr>
-              <w:t>ちびフジィ、スタンプ、映像、養魚場の公開体制 ―― いずれも一度作れば残り、翌年以降の施策の土台になります。単発の広告とは異なり、時間とともに価値が増していきます。７．複数部門で推進できるフジィが「絶滅危惧種を、獲らずに育てる技術」の象徴になることで、広報活動だけでなく、統合報告書・サステナビリティ報告・SDGs（目標14「海の豊かさを守ろう」）の文脈でも語れるようになります。予算と推進主体を一部門に依存しない企画になります。８．来年度の計画として、すぐに動かせる2027年という明確な節目があるため、「いつか実施する案」ではなく「2027年度に実施する計画」として検討できます。第1期の制作物（ちびフジィ、スタンプ128種、体験版）は本エントリーにすべて添付済みです。</w:t>
+              <w:t>ちびフジィ、スタンプ、映像、公開体制 ―― 一度作れば残り、時間とともに価値が増します。７．複数部門で推進できるフジィが「絶滅危惧種を、獲らずに育てる技術」の象徴になることで、広報活動だけでなく、統合報告書・サステナビリティ報告・SDGs（目標14「海の豊かさを守ろう」）の文脈でも語れるようになります。８．来年度の計画として、すぐに動かせる2027年という明確な節目があるため、「いつか実施する案」ではなく「2027年度に実施する計画」として検討できます。第1期の制作物（ちびフジィ、スタンプ128種、体験版）は本エントリーにすべて添付済みです。</w:t>
             </w:r>
           </w:p>
           <w:p>

</xml_diff>

<commit_message>
The Aqua World idea has its picture, and its tank is a real one
A full exhibit tank of sturgeon beside the shark wall, Chibi Fujie
saying the line on the pillar, the official Fujie on a nameplate on the
tank frame. The copy no longer says "a small tank" anywhere: a live fish
over a metre long needs a proper home, not a display box.

Co-Authored-By: Claude Fable 5.1 <noreply@anthropic.com>
</commit_message>
<xml_diff>
--- a/Fujie_Creative/05_submission/エントリーシート_記入済.docx
+++ b/Fujie_Creative/05_submission/エントリーシート_記入済.docx
@@ -114,7 +114,7 @@
           <w:rFonts w:ascii="ＭＳ 明朝" w:hAnsi="ＭＳ 明朝"/>
           <w:noProof/>
         </w:rPr>
-        <w:pict w14:anchorId="2A2553CA">
+        <w:pict w14:anchorId="67310B59">
           <v:shapetype id="_x0000_t75" coordsize="21600,21600" o:spt="75" o:preferrelative="t" path="m@4@5l@4@11@9@11@9@5xe" filled="f" stroked="f">
             <v:stroke joinstyle="miter"/>
             <v:formulas>
@@ -890,7 +890,7 @@
                 <w:sz w:val="17"/>
                 <w:szCs w:val="21"/>
               </w:rPr>
-              <w:t>サメの展示で知られる大洗のアクアワールドに小さな水槽を置き、里美のフジィを泳がせ、「サメじゃないです」のパネルを添えます。誰もがサメだと思う魚を本物のサメの隣に。水族館の判断を前提とした提案です。</w:t>
+              <w:t>サメの展示で知られる大洗のアクアワールドにチョウザメの展示水槽を設け、里美のフジィを泳がせ、「サメじゃないです」のパネルを添えます。誰もがサメだと思う魚を本物のサメの隣に。水族館の判断を前提とした提案です。</w:t>
             </w:r>
           </w:p>
           <w:p>
@@ -968,7 +968,7 @@
                 <w:sz w:val="17"/>
                 <w:szCs w:val="21"/>
               </w:rPr>
-              <w:t>2027年は、1987年の挑戦開始から40年、2002年の初出荷から25年にあたります。本コンテストの</w:t>
+              <w:t>2027年は、1987年の挑戦開始から40年、2002年の初出荷から25年にあたります。本コ</w:t>
             </w:r>
             <w:r>
               <w:rPr>
@@ -976,7 +976,7 @@
                 <w:sz w:val="17"/>
                 <w:szCs w:val="21"/>
               </w:rPr>
-              <w:t>結果発表は</w:t>
+              <w:t>ンテストの結果発表は</w:t>
             </w:r>
             <w:r>
               <w:rPr>

</xml_diff>

<commit_message>
Entry sheet and email mention the one-minute film, with the owner's latest edits
Co-Authored-By: Claude Opus 5.5 <noreply@anthropic.com>
</commit_message>
<xml_diff>
--- a/Fujie_Creative/05_submission/エントリーシート_記入済.docx
+++ b/Fujie_Creative/05_submission/エントリーシート_記入済.docx
@@ -102,7 +102,7 @@
       <w:pPr>
         <w:jc w:val="center"/>
         <w:rPr>
-          <w:rFonts w:ascii="ＭＳ 明朝" w:hAnsi="ＭＳ 明朝"/>
+          <w:rFonts w:ascii="ＭＳ 明朝" w:hAnsi="ＭＳ 明朝" w:hint="eastAsia"/>
           <w:b/>
           <w:bCs/>
           <w:sz w:val="24"/>
@@ -114,7 +114,7 @@
           <w:rFonts w:ascii="ＭＳ 明朝" w:hAnsi="ＭＳ 明朝"/>
           <w:noProof/>
         </w:rPr>
-        <w:pict w14:anchorId="67310B59">
+        <w:pict w14:anchorId="7CD5F49D">
           <v:shapetype id="_x0000_t75" coordsize="21600,21600" o:spt="75" o:preferrelative="t" path="m@4@5l@4@11@9@11@9@5xe" filled="f" stroked="f">
             <v:stroke joinstyle="miter"/>
             <v:formulas>
@@ -144,7 +144,7 @@
       <w:pPr>
         <w:jc w:val="center"/>
         <w:rPr>
-          <w:rFonts w:ascii="ＭＳ 明朝" w:hAnsi="ＭＳ 明朝"/>
+          <w:rFonts w:ascii="ＭＳ 明朝" w:hAnsi="ＭＳ 明朝" w:hint="eastAsia"/>
           <w:sz w:val="24"/>
           <w:szCs w:val="24"/>
         </w:rPr>
@@ -219,21 +219,7 @@
           <w:rFonts w:ascii="游明朝" w:eastAsia="游明朝" w:hAnsi="游明朝"/>
           <w:szCs w:val="21"/>
         </w:rPr>
-        <w:t>Vittorio Zumpano（</w:t>
-      </w:r>
-      <w:r>
-        <w:rPr>
-          <w:rFonts w:ascii="游明朝" w:eastAsia="游明朝" w:hAnsi="游明朝" w:hint="eastAsia"/>
-          <w:szCs w:val="21"/>
-        </w:rPr>
-        <w:t>ビットリオ</w:t>
-      </w:r>
-      <w:r>
-        <w:rPr>
-          <w:rFonts w:ascii="游明朝" w:eastAsia="游明朝" w:hAnsi="游明朝"/>
-          <w:szCs w:val="21"/>
-        </w:rPr>
-        <w:t>・ズンパーノ）　／　株式会社ブレインパワー　大阪</w:t>
+        <w:t>Vittorio Zumpano（ビットリオ・ズンパーノ）　／　株式会社ブレインパワー　大阪</w:t>
       </w:r>
     </w:p>
     <w:p>
@@ -360,7 +346,7 @@
       <w:pPr>
         <w:jc w:val="left"/>
         <w:rPr>
-          <w:rFonts w:ascii="游明朝" w:eastAsia="游明朝" w:hAnsi="游明朝"/>
+          <w:rFonts w:ascii="游明朝" w:eastAsia="游明朝" w:hAnsi="游明朝" w:hint="eastAsia"/>
           <w:sz w:val="20"/>
           <w:szCs w:val="20"/>
         </w:rPr>
@@ -387,23 +373,23 @@
       <w:pPr>
         <w:jc w:val="left"/>
         <w:rPr>
+          <w:rFonts w:ascii="游明朝" w:eastAsia="游明朝" w:hAnsi="游明朝" w:hint="eastAsia"/>
+          <w:szCs w:val="21"/>
+        </w:rPr>
+      </w:pPr>
+      <w:r>
+        <w:rPr>
+          <w:rFonts w:ascii="游明朝" w:eastAsia="游明朝" w:hAnsi="游明朝" w:hint="eastAsia"/>
+          <w:szCs w:val="21"/>
+        </w:rPr>
+        <w:t>４）アイデア名：</w:t>
+      </w:r>
+      <w:r>
+        <w:rPr>
           <w:rFonts w:ascii="游明朝" w:eastAsia="游明朝" w:hAnsi="游明朝"/>
           <w:szCs w:val="21"/>
         </w:rPr>
-      </w:pPr>
-      <w:r>
-        <w:rPr>
-          <w:rFonts w:ascii="游明朝" w:eastAsia="游明朝" w:hAnsi="游明朝" w:hint="eastAsia"/>
-          <w:szCs w:val="21"/>
-        </w:rPr>
-        <w:t>４）アイデア名：</w:t>
-      </w:r>
-      <w:r>
-        <w:rPr>
-          <w:rFonts w:ascii="游明朝" w:eastAsia="游明朝" w:hAnsi="游明朝"/>
-          <w:szCs w:val="21"/>
-        </w:rPr>
-        <w:t>「フジィは、実在する。」―― 世界初の完全養殖ストーリーで、フジィを「シンボル」から「キャラクター」へ</w:t>
+        <w:t>「フジィは、実在する。」―― 世界初の完全養殖という事実を起点に、十三の施策でフジィを「シンボル」から「キャラクター」へ</w:t>
       </w:r>
     </w:p>
     <w:p>
@@ -525,8 +511,14 @@
         <w:gridCol w:w="9214"/>
       </w:tblGrid>
       <w:tr>
+        <w:tblPrEx>
+          <w:tblCellMar>
+            <w:top w:w="0" w:type="dxa"/>
+            <w:bottom w:w="0" w:type="dxa"/>
+          </w:tblCellMar>
+        </w:tblPrEx>
         <w:trPr>
-          <w:trHeight w:val="5210"/>
+          <w:trHeight w:val="3676"/>
         </w:trPr>
         <w:tc>
           <w:tcPr>
@@ -543,37 +535,90 @@
             </w:pPr>
             <w:r>
               <w:rPr>
-                <w:rFonts w:ascii="游明朝" w:eastAsia="游明朝" w:hAnsi="游明朝"/>
-                <w:sz w:val="17"/>
-                <w:szCs w:val="21"/>
-              </w:rPr>
-              <w:t xml:space="preserve">【企画の全体像は、下記でそのままご覧いただけます】</w:t>
-            </w:r>
-            <w:r>
-              <w:rPr>
-                <w:rFonts w:ascii="游明朝" w:eastAsia="游明朝" w:hAnsi="游明朝"/>
-                <w:sz w:val="17"/>
-                <w:szCs w:val="21"/>
-              </w:rPr>
-              <w:br/>
+                <w:rFonts w:ascii="游明朝" w:eastAsia="游明朝" w:hAnsi="游明朝" w:hint="eastAsia"/>
+                <w:sz w:val="17"/>
+                <w:szCs w:val="21"/>
+              </w:rPr>
+              <w:t>概要・ポイント</w:t>
+            </w:r>
+            <w:r>
+              <w:rPr>
+                <w:rFonts w:ascii="游明朝" w:eastAsia="游明朝" w:hAnsi="游明朝" w:hint="eastAsia"/>
+                <w:sz w:val="17"/>
+                <w:szCs w:val="21"/>
+              </w:rPr>
+              <w:t>：</w:t>
+            </w:r>
+          </w:p>
+          <w:p>
+            <w:pPr>
+              <w:jc w:val="left"/>
+              <w:rPr>
+                <w:rFonts w:ascii="游明朝" w:eastAsia="游明朝" w:hAnsi="游明朝"/>
+                <w:sz w:val="17"/>
+                <w:szCs w:val="21"/>
+              </w:rPr>
+            </w:pPr>
+            <w:r>
+              <w:rPr>
+                <w:rFonts w:ascii="游明朝" w:eastAsia="游明朝" w:hAnsi="游明朝"/>
+                <w:sz w:val="17"/>
+                <w:szCs w:val="21"/>
+              </w:rPr>
+              <w:t>【企画の全体像は、下記でそのままご覧いただけます】</w:t>
+            </w:r>
+          </w:p>
+          <w:p>
+            <w:pPr>
+              <w:jc w:val="left"/>
+              <w:rPr>
+                <w:rFonts w:ascii="游明朝" w:eastAsia="游明朝" w:hAnsi="游明朝"/>
+                <w:sz w:val="17"/>
+                <w:szCs w:val="21"/>
+              </w:rPr>
+            </w:pPr>
+            <w:r>
+              <w:rPr>
+                <w:rFonts w:ascii="游明朝" w:eastAsia="游明朝" w:hAnsi="游明朝"/>
+                <w:sz w:val="17"/>
+                <w:szCs w:val="21"/>
+              </w:rPr>
               <w:t xml:space="preserve">　https://don-bp.github.io/fuji_famous/studio-fa519005bf/</w:t>
             </w:r>
-            <w:r>
-              <w:rPr>
-                <w:rFonts w:ascii="游明朝" w:eastAsia="游明朝" w:hAnsi="游明朝"/>
-                <w:sz w:val="17"/>
-                <w:szCs w:val="21"/>
-              </w:rPr>
-              <w:br/>
-              <w:t xml:space="preserve">　年表・ちびフジィ・スタンプ128種・グッズ・和紋、そして体験版「フジィを育てよう」まで、この1つのアドレスからご覧いただけます。スマートフォンにも対応しています。</w:t>
-            </w:r>
-            <w:r>
-              <w:rPr>
-                <w:rFonts w:ascii="游明朝" w:eastAsia="游明朝" w:hAnsi="游明朝"/>
-                <w:sz w:val="17"/>
-                <w:szCs w:val="21"/>
-              </w:rPr>
-              <w:br/>
+          </w:p>
+          <w:p>
+            <w:pPr>
+              <w:jc w:val="left"/>
+              <w:rPr>
+                <w:rFonts w:ascii="游明朝" w:eastAsia="游明朝" w:hAnsi="游明朝"/>
+                <w:sz w:val="17"/>
+                <w:szCs w:val="21"/>
+              </w:rPr>
+            </w:pPr>
+            <w:r>
+              <w:rPr>
+                <w:rFonts w:ascii="游明朝" w:eastAsia="游明朝" w:hAnsi="游明朝"/>
+                <w:sz w:val="17"/>
+                <w:szCs w:val="21"/>
+              </w:rPr>
+              <w:t xml:space="preserve">　年表と約1分のアニメ・ちびフジィ・スタンプ128種・グッズ・和紋、そして体験版「フジィを育てよう」まで、この1つのアドレスからご覧いただけます。スマートフォンにも対応しています。</w:t>
+            </w:r>
+          </w:p>
+          <w:p>
+            <w:pPr>
+              <w:jc w:val="left"/>
+              <w:rPr>
+                <w:rFonts w:ascii="游明朝" w:eastAsia="游明朝" w:hAnsi="游明朝"/>
+                <w:sz w:val="17"/>
+                <w:szCs w:val="21"/>
+              </w:rPr>
+            </w:pPr>
+            <w:r>
+              <w:rPr>
+                <w:rFonts w:ascii="游明朝" w:eastAsia="游明朝" w:hAnsi="游明朝"/>
+                <w:sz w:val="17"/>
+                <w:szCs w:val="21"/>
+              </w:rPr>
               <w:t xml:space="preserve">　インターネットに接続できない場合は、添付の「フジィスタジオ_オフライン版.html」をブラウザで開いてください。同じ内容がそのまま入っています。</w:t>
             </w:r>
           </w:p>
@@ -588,917 +633,884 @@
             </w:pPr>
             <w:r>
               <w:rPr>
+                <w:rFonts w:ascii="游明朝" w:eastAsia="游明朝" w:hAnsi="游明朝"/>
+                <w:sz w:val="17"/>
+                <w:szCs w:val="21"/>
+              </w:rPr>
+              <w:t>フジィを有名にする最大の資産は、すでに社内にあります。「フジィは実在する」という事実です。</w:t>
+            </w:r>
+          </w:p>
+          <w:p>
+            <w:pPr>
+              <w:jc w:val="left"/>
+              <w:rPr>
+                <w:rFonts w:ascii="游明朝" w:eastAsia="游明朝" w:hAnsi="游明朝"/>
+                <w:sz w:val="17"/>
+                <w:szCs w:val="21"/>
+              </w:rPr>
+            </w:pPr>
+            <w:r>
+              <w:rPr>
+                <w:rFonts w:ascii="游明朝" w:eastAsia="游明朝" w:hAnsi="游明朝"/>
+                <w:sz w:val="17"/>
+                <w:szCs w:val="21"/>
+              </w:rPr>
+              <w:t>1987年、最高技術顧問・故 西堀栄三郎先生の「フジキンのバルブを使ってチョウザメの養殖を始めてみないか」という一言から、挑戦は始まりました。初年度の生残率はわずか5％。それでも1998年に世界初の水槽内完全養殖を達成し、2002年には日本初のキャビア出荷を実現。里美養魚場（茨城県常陸太田市）には、いまも1万尾を超える“本物のフジィ”が泳いでいます。</w:t>
+            </w:r>
+          </w:p>
+          <w:p>
+            <w:pPr>
+              <w:jc w:val="left"/>
+              <w:rPr>
+                <w:rFonts w:ascii="游明朝" w:eastAsia="游明朝" w:hAnsi="游明朝"/>
+                <w:sz w:val="17"/>
+                <w:szCs w:val="21"/>
+              </w:rPr>
+            </w:pPr>
+            <w:r>
+              <w:rPr>
+                <w:rFonts w:ascii="游明朝" w:eastAsia="游明朝" w:hAnsi="游明朝"/>
+                <w:sz w:val="17"/>
+                <w:szCs w:val="21"/>
+              </w:rPr>
+              <w:t>バルブメーカーが、日本の国産キャビアを生んだ。これほど人に話したくなる物語を持つBtoB企業は、他にありません。さらに、この物語には続きがあります。チョウザメはIUCNレッドリストで「もっとも絶滅の危機にある生物群」とされ、現存する全種が絶滅危惧種です。完全養殖とは、「もう川から一尾も獲らなくていい」という技術にほかなりません。フジキンがつくったのは珍味ではなく、この魚を獲らずに済ませる方法でした。食の話にとどめず保全の話とし</w:t>
+            </w:r>
+            <w:r>
+              <w:rPr>
+                <w:rFonts w:ascii="游明朝" w:eastAsia="游明朝" w:hAnsi="游明朝"/>
+                <w:sz w:val="17"/>
+                <w:szCs w:val="21"/>
+              </w:rPr>
+              <w:lastRenderedPageBreak/>
+              <w:t>て語ることで、広報だけでなくサステナビリティ・統合報告の文脈にも乗せられます。しかし現在、この物語はフジィと結びついていません。本企画は、この物語を軸にフジィを「シンボル」から「キャラクター」へ育てる計画です。</w:t>
+            </w:r>
+          </w:p>
+          <w:p>
+            <w:pPr>
+              <w:jc w:val="left"/>
+              <w:rPr>
+                <w:rFonts w:ascii="游明朝" w:eastAsia="游明朝" w:hAnsi="游明朝"/>
+                <w:sz w:val="17"/>
+                <w:szCs w:val="21"/>
+              </w:rPr>
+            </w:pPr>
+            <w:r>
+              <w:rPr>
+                <w:rFonts w:ascii="游明朝" w:eastAsia="游明朝" w:hAnsi="游明朝"/>
+                <w:sz w:val="17"/>
+                <w:szCs w:val="21"/>
+              </w:rPr>
+              <w:t>①ちびフジィ ―― 第2の姿を新設する</w:t>
+            </w:r>
+          </w:p>
+          <w:p>
+            <w:pPr>
+              <w:jc w:val="left"/>
+              <w:rPr>
+                <w:rFonts w:ascii="游明朝" w:eastAsia="游明朝" w:hAnsi="游明朝"/>
+                <w:sz w:val="17"/>
+                <w:szCs w:val="21"/>
+              </w:rPr>
+            </w:pPr>
+            <w:r>
+              <w:rPr>
+                <w:rFonts w:ascii="游明朝" w:eastAsia="游明朝" w:hAnsi="游明朝"/>
+                <w:sz w:val="17"/>
+                <w:szCs w:val="21"/>
+              </w:rPr>
+              <w:t>現行マニュアルは一切変更せず、公式フジィは企業シンボルとして守ったまま、表情と親しみを担う「ちびフジィ」を公式に追加します。シンボルは笑うことも抱きしめられることもできません。有名になるために不足しているのは、この一点です。</w:t>
+            </w:r>
+          </w:p>
+          <w:p>
+            <w:pPr>
+              <w:jc w:val="left"/>
+              <w:rPr>
+                <w:rFonts w:ascii="游明朝" w:eastAsia="游明朝" w:hAnsi="游明朝"/>
+                <w:sz w:val="17"/>
+                <w:szCs w:val="21"/>
+              </w:rPr>
+            </w:pPr>
+            <w:r>
+              <w:rPr>
+                <w:rFonts w:ascii="游明朝" w:eastAsia="游明朝" w:hAnsi="游明朝"/>
+                <w:sz w:val="17"/>
+                <w:szCs w:val="21"/>
+              </w:rPr>
+              <w:t>②LINEスタンプ128種を無料配布する</w:t>
+            </w:r>
+          </w:p>
+          <w:p>
+            <w:pPr>
+              <w:jc w:val="left"/>
+              <w:rPr>
+                <w:rFonts w:ascii="游明朝" w:eastAsia="游明朝" w:hAnsi="游明朝"/>
+                <w:sz w:val="17"/>
+                <w:szCs w:val="21"/>
+              </w:rPr>
+            </w:pPr>
+            <w:r>
+              <w:rPr>
+                <w:rFonts w:ascii="游明朝" w:eastAsia="游明朝" w:hAnsi="游明朝"/>
+                <w:sz w:val="17"/>
+                <w:szCs w:val="21"/>
+              </w:rPr>
+              <w:t>友だち追加を条件とした無料配布は、日本で最も費用対効果の高い認知獲得手段です。スタンプは「友人が」「私的な会話で」「自発的に」送るため、広告では届かない場所に届きます。128種（日本語64・英語64）は制作済みで、別資料に添付しています。</w:t>
+            </w:r>
+          </w:p>
+          <w:p>
+            <w:pPr>
+              <w:jc w:val="left"/>
+              <w:rPr>
+                <w:rFonts w:ascii="游明朝" w:eastAsia="游明朝" w:hAnsi="游明朝"/>
+                <w:sz w:val="17"/>
+                <w:szCs w:val="21"/>
+              </w:rPr>
+            </w:pPr>
+            <w:r>
+              <w:rPr>
+                <w:rFonts w:ascii="游明朝" w:eastAsia="游明朝" w:hAnsi="游明朝"/>
+                <w:sz w:val="17"/>
+                <w:szCs w:val="21"/>
+              </w:rPr>
+              <w:t>③フジィに“中の人”を与える</w:t>
+            </w:r>
+          </w:p>
+          <w:p>
+            <w:pPr>
+              <w:jc w:val="left"/>
+              <w:rPr>
+                <w:rFonts w:ascii="游明朝" w:eastAsia="游明朝" w:hAnsi="游明朝"/>
+                <w:sz w:val="17"/>
+                <w:szCs w:val="21"/>
+              </w:rPr>
+            </w:pPr>
+            <w:r>
+              <w:rPr>
+                <w:rFonts w:ascii="游明朝" w:eastAsia="游明朝" w:hAnsi="游明朝"/>
+                <w:sz w:val="17"/>
+                <w:szCs w:val="21"/>
+              </w:rPr>
+              <w:t>公式Instagramは現在114フォロワー。弱点ではなく余白です。1万尾の給餌、ふ化の瞬間、夜明けの養魚場 ―― 誰も見たことのない映像を、フジキンだけが持っています。</w:t>
+            </w:r>
+          </w:p>
+          <w:p>
+            <w:pPr>
+              <w:jc w:val="left"/>
+              <w:rPr>
+                <w:rFonts w:ascii="游明朝" w:eastAsia="游明朝" w:hAnsi="游明朝"/>
+                <w:sz w:val="17"/>
+                <w:szCs w:val="21"/>
+              </w:rPr>
+            </w:pPr>
+            <w:r>
+              <w:rPr>
+                <w:rFonts w:ascii="游明朝" w:eastAsia="游明朝" w:hAnsi="游明朝"/>
+                <w:sz w:val="17"/>
+                <w:szCs w:val="21"/>
+              </w:rPr>
+              <w:t>④ちびフジィを無償開放する</w:t>
+            </w:r>
+          </w:p>
+          <w:p>
+            <w:pPr>
+              <w:jc w:val="left"/>
+              <w:rPr>
+                <w:rFonts w:ascii="游明朝" w:eastAsia="游明朝" w:hAnsi="游明朝"/>
+                <w:sz w:val="17"/>
+                <w:szCs w:val="21"/>
+              </w:rPr>
+            </w:pPr>
+            <w:r>
+              <w:rPr>
+                <w:rFonts w:ascii="游明朝" w:eastAsia="游明朝" w:hAnsi="游明朝"/>
+                <w:sz w:val="17"/>
+                <w:szCs w:val="21"/>
+              </w:rPr>
+              <w:t>フジキンは稚魚を全国の養殖業者へ販売しています。その取引先に無償開放すれば、日本中の国産キャビアのパッケージがそのまま広告になります。追加費用はかからず、既存の取引網だけで成立します。</w:t>
+            </w:r>
+          </w:p>
+          <w:p>
+            <w:pPr>
+              <w:jc w:val="left"/>
+              <w:rPr>
+                <w:rFonts w:ascii="游明朝" w:eastAsia="游明朝" w:hAnsi="游明朝"/>
+                <w:sz w:val="17"/>
+                <w:szCs w:val="21"/>
+              </w:rPr>
+            </w:pPr>
+            <w:r>
+              <w:rPr>
+                <w:rFonts w:ascii="游明朝" w:eastAsia="游明朝" w:hAnsi="游明朝"/>
+                <w:sz w:val="17"/>
+                <w:szCs w:val="21"/>
+              </w:rPr>
+              <w:t>⑤「会いに行けるマスコット」にする ―― 年に一度の公開日</w:t>
+            </w:r>
+          </w:p>
+          <w:p>
+            <w:pPr>
+              <w:jc w:val="left"/>
+              <w:rPr>
+                <w:rFonts w:ascii="游明朝" w:eastAsia="游明朝" w:hAnsi="游明朝"/>
+                <w:sz w:val="17"/>
+                <w:szCs w:val="21"/>
+              </w:rPr>
+            </w:pPr>
+            <w:r>
+              <w:rPr>
+                <w:rFonts w:ascii="游明朝" w:eastAsia="游明朝" w:hAnsi="游明朝"/>
+                <w:sz w:val="17"/>
+                <w:szCs w:val="21"/>
+              </w:rPr>
+              <w:t>里美養魚場（常陸太田市）を年に一度、地元の40家族に抽選で公開します。午前は、その年に卵からかえった「2027年組」への手紙。封をして、創業100周年の2030年に開封します（魚は年ごとの組で育つため、一尾ずつ追う必要はありません）。午後は、日本で初めてこの魚からつくられたキャビアを小さな匙で一口。この日を「チョウザメの日」として日本記念日協会に登録し、フジィの誕生日と重ねます。全種が絶滅危惧種のこの魚に、まだ記念日はありません。</w:t>
+            </w:r>
+          </w:p>
+          <w:p>
+            <w:pPr>
+              <w:jc w:val="left"/>
+              <w:rPr>
+                <w:rFonts w:ascii="游明朝" w:eastAsia="游明朝" w:hAnsi="游明朝"/>
+                <w:sz w:val="17"/>
+                <w:szCs w:val="21"/>
+              </w:rPr>
+            </w:pPr>
+            <w:r>
+              <w:rPr>
+                <w:rFonts w:ascii="游明朝" w:eastAsia="游明朝" w:hAnsi="游明朝"/>
+                <w:sz w:val="17"/>
+                <w:szCs w:val="21"/>
+              </w:rPr>
+              <w:t>⑥1987年の物語を映像化する</w:t>
+            </w:r>
+          </w:p>
+          <w:p>
+            <w:pPr>
+              <w:jc w:val="left"/>
+              <w:rPr>
+                <w:rFonts w:ascii="游明朝" w:eastAsia="游明朝" w:hAnsi="游明朝"/>
+                <w:sz w:val="17"/>
+                <w:szCs w:val="21"/>
+              </w:rPr>
+            </w:pPr>
+            <w:r>
+              <w:rPr>
+                <w:rFonts w:ascii="游明朝" w:eastAsia="游明朝" w:hAnsi="游明朝"/>
+                <w:sz w:val="17"/>
+                <w:szCs w:val="21"/>
+              </w:rPr>
+              <w:t>ボルガ川の船上で初めて口にしたキャビア、生残率5％の初年度、そして世界初へ。ロケ地はすべて自社保有です。</w:t>
+            </w:r>
+          </w:p>
+          <w:p>
+            <w:pPr>
+              <w:jc w:val="left"/>
+              <w:rPr>
+                <w:rFonts w:ascii="游明朝" w:eastAsia="游明朝" w:hAnsi="游明朝"/>
+                <w:sz w:val="17"/>
+                <w:szCs w:val="21"/>
+              </w:rPr>
+            </w:pPr>
+            <w:r>
+              <w:rPr>
+                <w:rFonts w:ascii="游明朝" w:eastAsia="游明朝" w:hAnsi="游明朝"/>
+                <w:sz w:val="17"/>
+                <w:szCs w:val="21"/>
+              </w:rPr>
+              <w:t>⑦「サメじゃないです。」を入口の一言にする</w:t>
+            </w:r>
+          </w:p>
+          <w:p>
+            <w:pPr>
+              <w:jc w:val="left"/>
+              <w:rPr>
+                <w:rFonts w:ascii="游明朝" w:eastAsia="游明朝" w:hAnsi="游明朝"/>
+                <w:sz w:val="17"/>
+                <w:szCs w:val="21"/>
+              </w:rPr>
+            </w:pPr>
+            <w:r>
+              <w:rPr>
+                <w:rFonts w:ascii="游明朝" w:eastAsia="游明朝" w:hAnsi="游明朝"/>
+                <w:sz w:val="17"/>
+                <w:szCs w:val="21"/>
+              </w:rPr>
+              <w:t>チョウザメは「蝶のサメ」と書くため、ほぼ全員が最初にサメだと誤解します。直すのではなく入口に使い、「サメより、ずっと少ないんです。」と続ければ、二行で正体と状況が伝わります。この一言を発するのはちびフジィで、公式フジィに文字は重ねません（第7条）。</w:t>
+            </w:r>
+          </w:p>
+          <w:p>
+            <w:pPr>
+              <w:jc w:val="left"/>
+              <w:rPr>
+                <w:rFonts w:ascii="游明朝" w:eastAsia="游明朝" w:hAnsi="游明朝"/>
+                <w:sz w:val="17"/>
+                <w:szCs w:val="21"/>
+              </w:rPr>
+            </w:pPr>
+            <w:r>
+              <w:rPr>
+                <w:rFonts w:ascii="游明朝" w:eastAsia="游明朝" w:hAnsi="游明朝"/>
+                <w:sz w:val="17"/>
+                <w:szCs w:val="21"/>
+              </w:rPr>
+              <w:t>⑧水族館のサメの隣に、本物のフジィを</w:t>
+            </w:r>
+          </w:p>
+          <w:p>
+            <w:pPr>
+              <w:jc w:val="left"/>
+              <w:rPr>
+                <w:rFonts w:ascii="游明朝" w:eastAsia="游明朝" w:hAnsi="游明朝"/>
+                <w:sz w:val="17"/>
+                <w:szCs w:val="21"/>
+              </w:rPr>
+            </w:pPr>
+            <w:r>
+              <w:rPr>
+                <w:rFonts w:ascii="游明朝" w:eastAsia="游明朝" w:hAnsi="游明朝"/>
+                <w:sz w:val="17"/>
+                <w:szCs w:val="21"/>
+              </w:rPr>
+              <w:t>サメの展示で知られる大洗のアクアワールドにチョウザメの展示水槽を設け、里美のフジィを泳がせ、「サメじゃないです」のパネルを添えます。誰もがサメだと思う魚を本物のサメの隣に。水族館の判断を前提とした提案です。</w:t>
+            </w:r>
+          </w:p>
+          <w:p>
+            <w:pPr>
+              <w:jc w:val="left"/>
+              <w:rPr>
+                <w:rFonts w:ascii="游明朝" w:eastAsia="游明朝" w:hAnsi="游明朝"/>
+                <w:sz w:val="17"/>
+                <w:szCs w:val="21"/>
+              </w:rPr>
+            </w:pPr>
+            <w:r>
+              <w:rPr>
+                <w:rFonts w:ascii="游明朝" w:eastAsia="游明朝" w:hAnsi="游明朝"/>
+                <w:sz w:val="17"/>
+                <w:szCs w:val="21"/>
+              </w:rPr>
+              <w:t>⑨常陸太田市に、フジィのマンホール</w:t>
+            </w:r>
+          </w:p>
+          <w:p>
+            <w:pPr>
+              <w:jc w:val="left"/>
+              <w:rPr>
+                <w:rFonts w:ascii="游明朝" w:eastAsia="游明朝" w:hAnsi="游明朝"/>
+                <w:sz w:val="17"/>
+                <w:szCs w:val="21"/>
+              </w:rPr>
+            </w:pPr>
+            <w:r>
+              <w:rPr>
+                <w:rFonts w:ascii="游明朝" w:eastAsia="游明朝" w:hAnsi="游明朝"/>
+                <w:sz w:val="17"/>
+                <w:szCs w:val="21"/>
+              </w:rPr>
+              <w:t>駅前・市役所・養魚場の門に3</w:t>
+            </w:r>
+            <w:r>
+              <w:rPr>
                 <w:rFonts w:ascii="游明朝" w:eastAsia="游明朝" w:hAnsi="游明朝" w:hint="eastAsia"/>
                 <w:sz w:val="17"/>
                 <w:szCs w:val="21"/>
               </w:rPr>
-              <w:t>概要・ポイント</w:t>
-            </w:r>
+              <w:t>〜</w:t>
+            </w:r>
+            <w:r>
+              <w:rPr>
+                <w:rFonts w:ascii="游明朝" w:eastAsia="游明朝" w:hAnsi="游明朝"/>
+                <w:sz w:val="17"/>
+                <w:szCs w:val="21"/>
+              </w:rPr>
+              <w:t>5枚。カラーの蓋には公式フジィを原画どおりの色で（色の再現はマニュアル管理者の確認を条件に）、別の蓋にはちびフジィを。地元紙が必ず報じ、一度置けば何十年も残ります。</w:t>
+            </w:r>
+          </w:p>
+          <w:p>
+            <w:pPr>
+              <w:jc w:val="left"/>
+              <w:rPr>
+                <w:rFonts w:ascii="游明朝" w:eastAsia="游明朝" w:hAnsi="游明朝"/>
+                <w:sz w:val="17"/>
+                <w:szCs w:val="21"/>
+              </w:rPr>
+            </w:pPr>
             <w:r>
               <w:rPr>
                 <w:rFonts w:ascii="游明朝" w:eastAsia="游明朝" w:hAnsi="游明朝" w:hint="eastAsia"/>
                 <w:sz w:val="17"/>
                 <w:szCs w:val="21"/>
               </w:rPr>
-              <w:t>：</w:t>
-            </w:r>
-          </w:p>
-          <w:p>
-            <w:pPr>
-              <w:jc w:val="left"/>
-              <w:rPr>
-                <w:rFonts w:ascii="游明朝" w:eastAsia="游明朝" w:hAnsi="游明朝"/>
-                <w:sz w:val="17"/>
-                <w:szCs w:val="21"/>
-              </w:rPr>
-            </w:pPr>
-            <w:r>
-              <w:rPr>
-                <w:rFonts w:ascii="游明朝" w:eastAsia="游明朝" w:hAnsi="游明朝"/>
-                <w:sz w:val="17"/>
-                <w:szCs w:val="21"/>
-              </w:rPr>
-              <w:t>フジィを有名にする最大の資産は、すでに社内にあります。「フジィは実在する」という事実です。</w:t>
-            </w:r>
-          </w:p>
-          <w:p>
-            <w:pPr>
-              <w:jc w:val="left"/>
-              <w:rPr>
-                <w:rFonts w:ascii="游明朝" w:eastAsia="游明朝" w:hAnsi="游明朝"/>
-                <w:sz w:val="17"/>
-                <w:szCs w:val="21"/>
-              </w:rPr>
-            </w:pPr>
-            <w:r>
-              <w:rPr>
-                <w:rFonts w:ascii="游明朝" w:eastAsia="游明朝" w:hAnsi="游明朝"/>
-                <w:sz w:val="17"/>
-                <w:szCs w:val="21"/>
-              </w:rPr>
-              <w:t>1987年、最高技術顧問・故 西堀栄三郎先生の「フジキンのバルブを使ってチョウザメの養殖を始めてみないか」という一言から、挑戦は始まりました。初年度の生残率はわずか5％。それでも1998年に世界初の水槽内完全養殖を達成し、2002年には日本初のキャビア出荷を実現。里美養魚場（茨城県常陸太田市）には、いまも1万尾を超える“本物のフジィ”が泳いでいます。</w:t>
-            </w:r>
-          </w:p>
-          <w:p>
-            <w:pPr>
-              <w:jc w:val="left"/>
-              <w:rPr>
-                <w:rFonts w:ascii="游明朝" w:eastAsia="游明朝" w:hAnsi="游明朝"/>
-                <w:sz w:val="17"/>
-                <w:szCs w:val="21"/>
-              </w:rPr>
-            </w:pPr>
-            <w:r>
-              <w:rPr>
-                <w:rFonts w:ascii="游明朝" w:eastAsia="游明朝" w:hAnsi="游明朝"/>
-                <w:sz w:val="17"/>
-                <w:szCs w:val="21"/>
-              </w:rPr>
-              <w:t>バルブメーカーが、日本の国産キャビアを生んだ。これほど人に話したくなる物語を持つ</w:t>
-            </w:r>
-            <w:proofErr w:type="spellStart"/>
-            <w:r>
-              <w:rPr>
-                <w:rFonts w:ascii="游明朝" w:eastAsia="游明朝" w:hAnsi="游明朝"/>
-                <w:sz w:val="17"/>
-                <w:szCs w:val="21"/>
-              </w:rPr>
-              <w:t>BtoB</w:t>
-            </w:r>
-            <w:proofErr w:type="spellEnd"/>
-            <w:r>
-              <w:rPr>
-                <w:rFonts w:ascii="游明朝" w:eastAsia="游明朝" w:hAnsi="游明朝"/>
-                <w:sz w:val="17"/>
-                <w:szCs w:val="21"/>
-              </w:rPr>
-              <w:t>企業は、他にありません。さらに、この物語には続きがあります。チョウザメはIUCNレッドリストで「もっとも絶滅の危機にある生物群」とされ、現存する全種が絶滅危惧種です。完全養殖とは、「もう川から一尾も獲らなくていい」という技術にほかなりません。フジキンがつくったのは珍味ではなく、この魚を獲らずに済ませる方法でした。食の話にとどめず保全の話として語ることで、広報だけでなくサステナビリティ・統合報告の文脈にも乗せられます。しかし現在、この物語はフジィと結びついていません。本企画は、この物語を軸にフジィを「シンボル」から「キャラクター」へ育てる計画です。</w:t>
-            </w:r>
-          </w:p>
-          <w:p>
-            <w:pPr>
-              <w:jc w:val="left"/>
-              <w:rPr>
-                <w:rFonts w:ascii="游明朝" w:eastAsia="游明朝" w:hAnsi="游明朝"/>
-                <w:sz w:val="17"/>
-                <w:szCs w:val="21"/>
-              </w:rPr>
-            </w:pPr>
-          </w:p>
-          <w:p>
-            <w:pPr>
-              <w:jc w:val="left"/>
-              <w:rPr>
-                <w:rFonts w:ascii="游明朝" w:eastAsia="游明朝" w:hAnsi="游明朝"/>
-                <w:sz w:val="17"/>
-                <w:szCs w:val="21"/>
-              </w:rPr>
-            </w:pPr>
-          </w:p>
-          <w:p>
-            <w:pPr>
-              <w:jc w:val="left"/>
-              <w:rPr>
-                <w:rFonts w:ascii="游明朝" w:eastAsia="游明朝" w:hAnsi="游明朝"/>
-                <w:sz w:val="17"/>
-                <w:szCs w:val="21"/>
-              </w:rPr>
-            </w:pPr>
-          </w:p>
-          <w:p>
-            <w:pPr>
-              <w:jc w:val="left"/>
-              <w:rPr>
-                <w:rFonts w:ascii="游明朝" w:eastAsia="游明朝" w:hAnsi="游明朝"/>
-                <w:sz w:val="17"/>
-                <w:szCs w:val="21"/>
-              </w:rPr>
-            </w:pPr>
-          </w:p>
-          <w:p>
-            <w:pPr>
-              <w:jc w:val="left"/>
-              <w:rPr>
-                <w:rFonts w:ascii="游明朝" w:eastAsia="游明朝" w:hAnsi="游明朝"/>
-                <w:sz w:val="17"/>
-                <w:szCs w:val="21"/>
-              </w:rPr>
-            </w:pPr>
-            <w:r>
-              <w:rPr>
-                <w:rFonts w:ascii="游明朝" w:eastAsia="游明朝" w:hAnsi="游明朝"/>
-                <w:sz w:val="17"/>
-                <w:szCs w:val="21"/>
-              </w:rPr>
-              <w:lastRenderedPageBreak/>
-              <w:t>①ちびフジィ ―― 第2の姿を新設する</w:t>
-            </w:r>
-          </w:p>
-          <w:p>
-            <w:pPr>
-              <w:jc w:val="left"/>
-              <w:rPr>
-                <w:rFonts w:ascii="游明朝" w:eastAsia="游明朝" w:hAnsi="游明朝"/>
-                <w:sz w:val="17"/>
-                <w:szCs w:val="21"/>
-              </w:rPr>
-            </w:pPr>
-            <w:r>
-              <w:rPr>
-                <w:rFonts w:ascii="游明朝" w:eastAsia="游明朝" w:hAnsi="游明朝"/>
-                <w:sz w:val="17"/>
-                <w:szCs w:val="21"/>
-              </w:rPr>
-              <w:t>現行マニュアルは一切変更せず、公式フジィは企業シンボルとして守ったまま、表情と親しみを担う「ちびフジィ」を公式に追加します。シンボルは笑うことも抱きしめられることもできません。有名になるために不足しているのは、この一点です。</w:t>
-            </w:r>
-          </w:p>
-          <w:p>
-            <w:pPr>
-              <w:jc w:val="left"/>
-              <w:rPr>
-                <w:rFonts w:ascii="游明朝" w:eastAsia="游明朝" w:hAnsi="游明朝"/>
-                <w:sz w:val="17"/>
-                <w:szCs w:val="21"/>
-              </w:rPr>
-            </w:pPr>
-            <w:r>
-              <w:rPr>
-                <w:rFonts w:ascii="游明朝" w:eastAsia="游明朝" w:hAnsi="游明朝"/>
-                <w:sz w:val="17"/>
-                <w:szCs w:val="21"/>
-              </w:rPr>
-              <w:t>②LINEスタンプ128種を無料配布する</w:t>
-            </w:r>
-          </w:p>
-          <w:p>
-            <w:pPr>
-              <w:jc w:val="left"/>
-              <w:rPr>
-                <w:rFonts w:ascii="游明朝" w:eastAsia="游明朝" w:hAnsi="游明朝"/>
-                <w:sz w:val="17"/>
-                <w:szCs w:val="21"/>
-              </w:rPr>
-            </w:pPr>
-            <w:r>
-              <w:rPr>
-                <w:rFonts w:ascii="游明朝" w:eastAsia="游明朝" w:hAnsi="游明朝"/>
-                <w:sz w:val="17"/>
-                <w:szCs w:val="21"/>
-              </w:rPr>
-              <w:t>友だち追加を条件とした無料配布は、日本で最も費用対効果の高い認知獲得手段です。スタンプは「友人が」「私的な会話で」「自発的に」送るため、広告では届かない場所に届きます。128種（日本語64・英語64）は制作済みで、別資料に添付しています。</w:t>
-            </w:r>
-          </w:p>
-          <w:p>
-            <w:pPr>
-              <w:jc w:val="left"/>
-              <w:rPr>
-                <w:rFonts w:ascii="游明朝" w:eastAsia="游明朝" w:hAnsi="游明朝"/>
-                <w:sz w:val="17"/>
-                <w:szCs w:val="21"/>
-              </w:rPr>
-            </w:pPr>
-            <w:r>
-              <w:rPr>
-                <w:rFonts w:ascii="游明朝" w:eastAsia="游明朝" w:hAnsi="游明朝"/>
-                <w:sz w:val="17"/>
-                <w:szCs w:val="21"/>
-              </w:rPr>
-              <w:t>③フジィに“中の人”を与える</w:t>
-            </w:r>
-          </w:p>
-          <w:p>
-            <w:pPr>
-              <w:jc w:val="left"/>
-              <w:rPr>
-                <w:rFonts w:ascii="游明朝" w:eastAsia="游明朝" w:hAnsi="游明朝"/>
-                <w:sz w:val="17"/>
-                <w:szCs w:val="21"/>
-              </w:rPr>
-            </w:pPr>
-            <w:r>
-              <w:rPr>
-                <w:rFonts w:ascii="游明朝" w:eastAsia="游明朝" w:hAnsi="游明朝"/>
-                <w:sz w:val="17"/>
-                <w:szCs w:val="21"/>
-              </w:rPr>
-              <w:t>公式Instagramは現在114フォロワー。弱点ではなく余白です。1万尾の給餌、ふ化の瞬間、夜明けの養魚場 ―― 誰も見たことのない映像を、フジキンだけが持っています。</w:t>
-            </w:r>
-          </w:p>
-          <w:p>
-            <w:pPr>
-              <w:jc w:val="left"/>
-              <w:rPr>
-                <w:rFonts w:ascii="游明朝" w:eastAsia="游明朝" w:hAnsi="游明朝"/>
-                <w:sz w:val="17"/>
-                <w:szCs w:val="21"/>
-              </w:rPr>
-            </w:pPr>
-            <w:r>
-              <w:rPr>
-                <w:rFonts w:ascii="游明朝" w:eastAsia="游明朝" w:hAnsi="游明朝"/>
-                <w:sz w:val="17"/>
-                <w:szCs w:val="21"/>
-              </w:rPr>
-              <w:t>④ちびフジィを無償開放する</w:t>
-            </w:r>
-          </w:p>
-          <w:p>
-            <w:pPr>
-              <w:jc w:val="left"/>
-              <w:rPr>
-                <w:rFonts w:ascii="游明朝" w:eastAsia="游明朝" w:hAnsi="游明朝"/>
-                <w:sz w:val="17"/>
-                <w:szCs w:val="21"/>
-              </w:rPr>
-            </w:pPr>
-            <w:r>
-              <w:rPr>
-                <w:rFonts w:ascii="游明朝" w:eastAsia="游明朝" w:hAnsi="游明朝"/>
-                <w:sz w:val="17"/>
-                <w:szCs w:val="21"/>
-              </w:rPr>
-              <w:t>フジキンは稚魚を全国の養殖業者へ販売しています。その取引先に無償開放すれば、日本中の国産キャビアのパッケージがそのまま広告になります。追加費用はかからず、既存の取引網だけで成立します。</w:t>
-            </w:r>
-          </w:p>
-          <w:p>
-            <w:pPr>
-              <w:jc w:val="left"/>
-              <w:rPr>
-                <w:rFonts w:ascii="游明朝" w:eastAsia="游明朝" w:hAnsi="游明朝"/>
-                <w:sz w:val="17"/>
-                <w:szCs w:val="21"/>
-              </w:rPr>
-            </w:pPr>
-            <w:r>
-              <w:rPr>
-                <w:rFonts w:ascii="游明朝" w:eastAsia="游明朝" w:hAnsi="游明朝"/>
-                <w:sz w:val="17"/>
-                <w:szCs w:val="21"/>
-              </w:rPr>
-              <w:t>⑤「会いに行けるマスコット」にする ―― 年に一度の公開日</w:t>
-            </w:r>
-          </w:p>
-          <w:p>
-            <w:pPr>
-              <w:jc w:val="left"/>
-              <w:rPr>
-                <w:rFonts w:ascii="游明朝" w:eastAsia="游明朝" w:hAnsi="游明朝"/>
-                <w:sz w:val="17"/>
-                <w:szCs w:val="21"/>
-              </w:rPr>
-            </w:pPr>
-            <w:r>
-              <w:rPr>
-                <w:rFonts w:ascii="游明朝" w:eastAsia="游明朝" w:hAnsi="游明朝"/>
-                <w:sz w:val="17"/>
-                <w:szCs w:val="21"/>
-              </w:rPr>
-              <w:t>里美養魚場（常陸太田市）を年に一度、地元の40家族に抽選で公開します。午前は、その年に卵からかえった「2027年組」への手紙。封をして、創業100周年の2030年に開封します（魚は年ごとの組で育つため、一尾ずつ追う必要はありません）。午後は、日本で初めてこの魚からつくられたキャビアを小さな匙で一口。この日を「チョウザメの日」として日本記念日協会に登録し、フジィの誕生日と重ねます。全種が絶滅危惧種のこの魚に、まだ記念日はありません。</w:t>
-            </w:r>
-          </w:p>
-          <w:p>
-            <w:pPr>
-              <w:jc w:val="left"/>
-              <w:rPr>
-                <w:rFonts w:ascii="游明朝" w:eastAsia="游明朝" w:hAnsi="游明朝"/>
-                <w:sz w:val="17"/>
-                <w:szCs w:val="21"/>
-              </w:rPr>
-            </w:pPr>
-            <w:r>
-              <w:rPr>
-                <w:rFonts w:ascii="游明朝" w:eastAsia="游明朝" w:hAnsi="游明朝"/>
-                <w:sz w:val="17"/>
-                <w:szCs w:val="21"/>
-              </w:rPr>
-              <w:t>⑥1987年の物語を映像化する</w:t>
-            </w:r>
-          </w:p>
-          <w:p>
-            <w:pPr>
-              <w:jc w:val="left"/>
-              <w:rPr>
-                <w:rFonts w:ascii="游明朝" w:eastAsia="游明朝" w:hAnsi="游明朝"/>
-                <w:sz w:val="17"/>
-                <w:szCs w:val="21"/>
-              </w:rPr>
-            </w:pPr>
-            <w:r>
-              <w:rPr>
-                <w:rFonts w:ascii="游明朝" w:eastAsia="游明朝" w:hAnsi="游明朝"/>
-                <w:sz w:val="17"/>
-                <w:szCs w:val="21"/>
-              </w:rPr>
-              <w:t>ボルガ川の船上で初めて口にしたキャビア、生残率5％の初年度、そして世界初へ。ロケ地はすべて自社保有です。</w:t>
-            </w:r>
-          </w:p>
-          <w:p>
-            <w:pPr>
-              <w:jc w:val="left"/>
-              <w:rPr>
-                <w:rFonts w:ascii="游明朝" w:eastAsia="游明朝" w:hAnsi="游明朝"/>
-                <w:sz w:val="17"/>
-                <w:szCs w:val="21"/>
-              </w:rPr>
-            </w:pPr>
-            <w:r>
-              <w:rPr>
-                <w:rFonts w:ascii="游明朝" w:eastAsia="游明朝" w:hAnsi="游明朝"/>
-                <w:sz w:val="17"/>
-                <w:szCs w:val="21"/>
-              </w:rPr>
-              <w:t>⑦「サメじゃないです。」を入口の一言にする</w:t>
-            </w:r>
-          </w:p>
-          <w:p>
-            <w:pPr>
-              <w:jc w:val="left"/>
-              <w:rPr>
-                <w:rFonts w:ascii="游明朝" w:eastAsia="游明朝" w:hAnsi="游明朝"/>
-                <w:sz w:val="17"/>
-                <w:szCs w:val="21"/>
-              </w:rPr>
-            </w:pPr>
-            <w:r>
-              <w:rPr>
-                <w:rFonts w:ascii="游明朝" w:eastAsia="游明朝" w:hAnsi="游明朝"/>
-                <w:sz w:val="17"/>
-                <w:szCs w:val="21"/>
-              </w:rPr>
-              <w:t>チョウザメは「蝶のサメ」と書くため、ほぼ全員が最初にサメだと誤解します。直すのではなく入口に使い、「サメより、ずっと少ないんです。」と続ければ、二行で正体と状況が伝わります。この一言を発するのはちびフジィで、公式フジィに文字は重ねません（第7条）。</w:t>
-            </w:r>
-          </w:p>
-          <w:p>
-            <w:pPr>
-              <w:jc w:val="left"/>
-              <w:rPr>
-                <w:rFonts w:ascii="游明朝" w:eastAsia="游明朝" w:hAnsi="游明朝"/>
-                <w:sz w:val="17"/>
-                <w:szCs w:val="21"/>
-              </w:rPr>
-            </w:pPr>
-            <w:r>
-              <w:rPr>
-                <w:rFonts w:ascii="游明朝" w:eastAsia="游明朝" w:hAnsi="游明朝"/>
-                <w:sz w:val="17"/>
-                <w:szCs w:val="21"/>
-              </w:rPr>
-              <w:t>⑧水族館のサメの隣に、本物のフジィを</w:t>
-            </w:r>
-          </w:p>
-          <w:p>
-            <w:pPr>
-              <w:jc w:val="left"/>
-              <w:rPr>
-                <w:rFonts w:ascii="游明朝" w:eastAsia="游明朝" w:hAnsi="游明朝"/>
-                <w:sz w:val="17"/>
-                <w:szCs w:val="21"/>
-              </w:rPr>
-            </w:pPr>
-            <w:r>
-              <w:rPr>
-                <w:rFonts w:ascii="游明朝" w:eastAsia="游明朝" w:hAnsi="游明朝"/>
-                <w:sz w:val="17"/>
-                <w:szCs w:val="21"/>
-              </w:rPr>
-              <w:t>サメの展示で知られる大洗のアクアワールドにチョウザメの展示水槽を設け、里美のフジィを泳がせ、「サメじゃないです」のパネルを添えます。誰もがサメだと思う魚を本物のサメの隣に。水族館の判断を前提とした提案です。</w:t>
-            </w:r>
-          </w:p>
-          <w:p>
-            <w:pPr>
-              <w:jc w:val="left"/>
-              <w:rPr>
-                <w:rFonts w:ascii="游明朝" w:eastAsia="游明朝" w:hAnsi="游明朝"/>
-                <w:sz w:val="17"/>
-                <w:szCs w:val="21"/>
-              </w:rPr>
-            </w:pPr>
-            <w:r>
-              <w:rPr>
-                <w:rFonts w:ascii="游明朝" w:eastAsia="游明朝" w:hAnsi="游明朝"/>
-                <w:sz w:val="17"/>
-                <w:szCs w:val="21"/>
-              </w:rPr>
-              <w:t>⑨常陸太田市に、フジィのマンホール</w:t>
-            </w:r>
-          </w:p>
-          <w:p>
-            <w:pPr>
-              <w:jc w:val="left"/>
-              <w:rPr>
-                <w:rFonts w:ascii="游明朝" w:eastAsia="游明朝" w:hAnsi="游明朝"/>
-                <w:sz w:val="17"/>
-                <w:szCs w:val="21"/>
-              </w:rPr>
-            </w:pPr>
-            <w:r>
-              <w:rPr>
-                <w:rFonts w:ascii="游明朝" w:eastAsia="游明朝" w:hAnsi="游明朝"/>
-                <w:sz w:val="17"/>
-                <w:szCs w:val="21"/>
-              </w:rPr>
-              <w:t>駅前・市役所・養魚場の門に3</w:t>
-            </w:r>
-            <w:r>
+              <w:t>実施時期について。</w:t>
+            </w:r>
+            <w:r>
+              <w:rPr>
+                <w:rFonts w:ascii="游明朝" w:eastAsia="游明朝" w:hAnsi="游明朝"/>
+                <w:sz w:val="17"/>
+                <w:szCs w:val="21"/>
+              </w:rPr>
+              <w:t>2027年は、1987年の挑戦開始から40年、2002年の初出荷から25年にあたります。本コンテストの結果発表は2026年12月であり、本企画はそのまま2027年度の計画に乗せることができます。2028年には完全養殖から30年、そして2030年には創業100周年。創業100周年を、フジィが有名になった状態で迎えることを目標とします。</w:t>
+            </w:r>
+          </w:p>
+          <w:p>
+            <w:pPr>
+              <w:jc w:val="left"/>
               <w:rPr>
                 <w:rFonts w:ascii="游明朝" w:eastAsia="游明朝" w:hAnsi="游明朝" w:hint="eastAsia"/>
                 <w:sz w:val="17"/>
                 <w:szCs w:val="21"/>
               </w:rPr>
-              <w:t>〜</w:t>
-            </w:r>
-            <w:r>
-              <w:rPr>
-                <w:rFonts w:ascii="游明朝" w:eastAsia="游明朝" w:hAnsi="游明朝"/>
-                <w:sz w:val="17"/>
-                <w:szCs w:val="21"/>
-              </w:rPr>
-              <w:t>5枚。カラーの蓋には公式フジィを原画どおりの色で（色の再現はマニュアル管理者の確認を条件に）、別の蓋にはちびフジィを。地元紙が必ず報じ、一度置けば何十年も残ります。</w:t>
-            </w:r>
-          </w:p>
-          <w:p>
-            <w:pPr>
-              <w:jc w:val="left"/>
-              <w:rPr>
-                <w:rFonts w:ascii="游明朝" w:eastAsia="游明朝" w:hAnsi="游明朝"/>
-                <w:sz w:val="17"/>
-                <w:szCs w:val="21"/>
-              </w:rPr>
-            </w:pPr>
-            <w:r>
+            </w:pPr>
+          </w:p>
+          <w:p>
+            <w:pPr>
+              <w:jc w:val="left"/>
+              <w:rPr>
+                <w:rFonts w:ascii="游明朝" w:eastAsia="游明朝" w:hAnsi="游明朝"/>
+                <w:sz w:val="17"/>
+                <w:szCs w:val="21"/>
+              </w:rPr>
+            </w:pPr>
+          </w:p>
+          <w:p>
+            <w:pPr>
+              <w:jc w:val="left"/>
+              <w:rPr>
+                <w:rFonts w:ascii="游明朝" w:eastAsia="游明朝" w:hAnsi="游明朝"/>
+                <w:sz w:val="17"/>
+                <w:szCs w:val="21"/>
+              </w:rPr>
+            </w:pPr>
+          </w:p>
+          <w:p>
+            <w:pPr>
+              <w:jc w:val="left"/>
+              <w:rPr>
+                <w:rFonts w:ascii="游明朝" w:eastAsia="游明朝" w:hAnsi="游明朝"/>
+                <w:sz w:val="17"/>
+                <w:szCs w:val="21"/>
+              </w:rPr>
+            </w:pPr>
+          </w:p>
+          <w:p>
+            <w:pPr>
+              <w:jc w:val="left"/>
               <w:rPr>
                 <w:rFonts w:ascii="游明朝" w:eastAsia="游明朝" w:hAnsi="游明朝" w:hint="eastAsia"/>
                 <w:sz w:val="17"/>
                 <w:szCs w:val="21"/>
               </w:rPr>
-              <w:t>実施時期について。</w:t>
-            </w:r>
-            <w:r>
-              <w:rPr>
-                <w:rFonts w:ascii="游明朝" w:eastAsia="游明朝" w:hAnsi="游明朝"/>
-                <w:sz w:val="17"/>
-                <w:szCs w:val="21"/>
-              </w:rPr>
-              <w:t>2027年は、1987年の挑戦開始から40年、2002年の初出荷から25年にあたります。本コ</w:t>
-            </w:r>
+            </w:pPr>
+          </w:p>
+          <w:p>
+            <w:pPr>
+              <w:jc w:val="left"/>
+              <w:rPr>
+                <w:rFonts w:ascii="游明朝" w:eastAsia="游明朝" w:hAnsi="游明朝"/>
+                <w:sz w:val="17"/>
+                <w:szCs w:val="21"/>
+              </w:rPr>
+            </w:pPr>
             <w:r>
               <w:rPr>
                 <w:rFonts w:ascii="游明朝" w:eastAsia="游明朝" w:hAnsi="游明朝" w:hint="eastAsia"/>
                 <w:sz w:val="17"/>
                 <w:szCs w:val="21"/>
               </w:rPr>
-              <w:t>ンテストの結果発表は</w:t>
-            </w:r>
-            <w:r>
-              <w:rPr>
-                <w:rFonts w:ascii="游明朝" w:eastAsia="游明朝" w:hAnsi="游明朝"/>
-                <w:sz w:val="17"/>
-                <w:szCs w:val="21"/>
-              </w:rPr>
-              <w:t>2026年12月であり、本企画はそのまま2027年度の計画に乗せることができます。2028年には完全養殖から30年、そして2030年には創業100周年。創業100周年を、フジィが有名になった状態で迎えることを目標とします。</w:t>
-            </w:r>
-          </w:p>
-          <w:p>
-            <w:pPr>
-              <w:jc w:val="left"/>
-              <w:rPr>
-                <w:rFonts w:ascii="游明朝" w:eastAsia="游明朝" w:hAnsi="游明朝"/>
-                <w:sz w:val="17"/>
-                <w:szCs w:val="21"/>
-              </w:rPr>
-            </w:pPr>
-          </w:p>
-          <w:p>
-            <w:pPr>
-              <w:jc w:val="left"/>
-              <w:rPr>
-                <w:rFonts w:ascii="游明朝" w:eastAsia="游明朝" w:hAnsi="游明朝"/>
-                <w:sz w:val="17"/>
-                <w:szCs w:val="21"/>
-              </w:rPr>
-            </w:pPr>
-          </w:p>
-          <w:p>
-            <w:pPr>
-              <w:jc w:val="left"/>
-              <w:rPr>
-                <w:rFonts w:ascii="游明朝" w:eastAsia="游明朝" w:hAnsi="游明朝"/>
-                <w:sz w:val="17"/>
-                <w:szCs w:val="21"/>
-              </w:rPr>
-            </w:pPr>
-          </w:p>
-          <w:p>
-            <w:pPr>
-              <w:jc w:val="left"/>
-              <w:rPr>
-                <w:rFonts w:ascii="游明朝" w:eastAsia="游明朝" w:hAnsi="游明朝"/>
-                <w:sz w:val="17"/>
-                <w:szCs w:val="21"/>
-              </w:rPr>
-            </w:pPr>
-          </w:p>
-          <w:p>
-            <w:pPr>
-              <w:jc w:val="left"/>
-              <w:rPr>
-                <w:rFonts w:ascii="游明朝" w:eastAsia="游明朝" w:hAnsi="游明朝"/>
-                <w:sz w:val="17"/>
-                <w:szCs w:val="21"/>
-              </w:rPr>
-            </w:pPr>
+              <w:t>期待される</w:t>
+            </w:r>
             <w:r>
               <w:rPr>
                 <w:rFonts w:ascii="游明朝" w:eastAsia="游明朝" w:hAnsi="游明朝" w:hint="eastAsia"/>
                 <w:sz w:val="17"/>
                 <w:szCs w:val="21"/>
               </w:rPr>
-              <w:lastRenderedPageBreak/>
-              <w:t>期待される</w:t>
-            </w:r>
-            <w:r>
+              <w:t>効果：</w:t>
+            </w:r>
+          </w:p>
+          <w:p>
+            <w:pPr>
+              <w:jc w:val="left"/>
+              <w:rPr>
+                <w:rFonts w:ascii="游明朝" w:eastAsia="游明朝" w:hAnsi="游明朝"/>
+                <w:sz w:val="17"/>
+                <w:szCs w:val="21"/>
+              </w:rPr>
+            </w:pPr>
+            <w:r>
+              <w:rPr>
+                <w:rFonts w:ascii="游明朝" w:eastAsia="游明朝" w:hAnsi="游明朝"/>
+                <w:sz w:val="17"/>
+                <w:szCs w:val="21"/>
+              </w:rPr>
+              <w:t>１．「覚えられる会社」から「語られる会社」へ</w:t>
+            </w:r>
+          </w:p>
+          <w:p>
+            <w:pPr>
+              <w:jc w:val="left"/>
+              <w:rPr>
+                <w:rFonts w:ascii="游明朝" w:eastAsia="游明朝" w:hAnsi="游明朝"/>
+                <w:sz w:val="17"/>
+                <w:szCs w:val="21"/>
+              </w:rPr>
+            </w:pPr>
+            <w:r>
+              <w:rPr>
+                <w:rFonts w:ascii="游明朝" w:eastAsia="游明朝" w:hAnsi="游明朝"/>
+                <w:sz w:val="17"/>
+                <w:szCs w:val="21"/>
+              </w:rPr>
+              <w:t>「バルブの会社が日本のキャビアをつくった」という一文は、聞いた人が翌日 誰かに話したくなる強度を持っています。広告費をかけずに伝播する、唯一の資産です。</w:t>
+            </w:r>
+          </w:p>
+          <w:p>
+            <w:pPr>
+              <w:jc w:val="left"/>
+              <w:rPr>
+                <w:rFonts w:ascii="游明朝" w:eastAsia="游明朝" w:hAnsi="游明朝"/>
+                <w:sz w:val="17"/>
+                <w:szCs w:val="21"/>
+              </w:rPr>
+            </w:pPr>
+            <w:r>
+              <w:rPr>
+                <w:rFonts w:ascii="游明朝" w:eastAsia="游明朝" w:hAnsi="游明朝"/>
+                <w:sz w:val="17"/>
+                <w:szCs w:val="21"/>
+              </w:rPr>
+              <w:t>２．一般層への継続的な到達</w:t>
+            </w:r>
+          </w:p>
+          <w:p>
+            <w:pPr>
+              <w:jc w:val="left"/>
+              <w:rPr>
+                <w:rFonts w:ascii="游明朝" w:eastAsia="游明朝" w:hAnsi="游明朝"/>
+                <w:sz w:val="17"/>
+                <w:szCs w:val="21"/>
+              </w:rPr>
+            </w:pPr>
+            <w:r>
+              <w:rPr>
+                <w:rFonts w:ascii="游明朝" w:eastAsia="游明朝" w:hAnsi="游明朝"/>
+                <w:sz w:val="17"/>
+                <w:szCs w:val="21"/>
+              </w:rPr>
+              <w:t>LINEスタンプは、送信されるかぎり露出が続きます。一度の制作費で、個人間の会話に繰り返し現れます。</w:t>
+            </w:r>
+          </w:p>
+          <w:p>
+            <w:pPr>
+              <w:jc w:val="left"/>
+              <w:rPr>
+                <w:rFonts w:ascii="游明朝" w:eastAsia="游明朝" w:hAnsi="游明朝"/>
+                <w:sz w:val="17"/>
+                <w:szCs w:val="21"/>
+              </w:rPr>
+            </w:pPr>
+            <w:r>
+              <w:rPr>
+                <w:rFonts w:ascii="游明朝" w:eastAsia="游明朝" w:hAnsi="游明朝"/>
+                <w:sz w:val="17"/>
+                <w:szCs w:val="21"/>
+              </w:rPr>
+              <w:t>３．取引先を通じた面の拡大</w:t>
+            </w:r>
+          </w:p>
+          <w:p>
+            <w:pPr>
+              <w:jc w:val="left"/>
+              <w:rPr>
+                <w:rFonts w:ascii="游明朝" w:eastAsia="游明朝" w:hAnsi="游明朝"/>
+                <w:sz w:val="17"/>
+                <w:szCs w:val="21"/>
+              </w:rPr>
+            </w:pPr>
+            <w:r>
+              <w:rPr>
+                <w:rFonts w:ascii="游明朝" w:eastAsia="游明朝" w:hAnsi="游明朝"/>
+                <w:sz w:val="17"/>
+                <w:szCs w:val="21"/>
+              </w:rPr>
+              <w:t>稚魚取引先への無償開放により、フジキンが直接リーチできない一般消費者の食卓にフジィが届きます。</w:t>
+            </w:r>
+          </w:p>
+          <w:p>
+            <w:pPr>
+              <w:jc w:val="left"/>
+              <w:rPr>
+                <w:rFonts w:ascii="游明朝" w:eastAsia="游明朝" w:hAnsi="游明朝"/>
+                <w:sz w:val="17"/>
+                <w:szCs w:val="21"/>
+              </w:rPr>
+            </w:pPr>
+            <w:r>
+              <w:rPr>
+                <w:rFonts w:ascii="游明朝" w:eastAsia="游明朝" w:hAnsi="游明朝"/>
+                <w:sz w:val="17"/>
+                <w:szCs w:val="21"/>
+              </w:rPr>
+              <w:t>４．採用広報への波及</w:t>
+            </w:r>
+          </w:p>
+          <w:p>
+            <w:pPr>
+              <w:jc w:val="left"/>
+              <w:rPr>
+                <w:rFonts w:ascii="游明朝" w:eastAsia="游明朝" w:hAnsi="游明朝"/>
+                <w:sz w:val="17"/>
+                <w:szCs w:val="21"/>
+              </w:rPr>
+            </w:pPr>
+            <w:r>
+              <w:rPr>
+                <w:rFonts w:ascii="游明朝" w:eastAsia="游明朝" w:hAnsi="游明朝"/>
+                <w:sz w:val="17"/>
+                <w:szCs w:val="21"/>
+              </w:rPr>
+              <w:t>生残率5％から世界初に至った11年間は、企業ポリシー「極限への挑戦」そのものです。実話として語れるため、学生が最も反応する物語です。</w:t>
+            </w:r>
+          </w:p>
+          <w:p>
+            <w:pPr>
+              <w:jc w:val="left"/>
+              <w:rPr>
+                <w:rFonts w:ascii="游明朝" w:eastAsia="游明朝" w:hAnsi="游明朝"/>
+                <w:sz w:val="17"/>
+                <w:szCs w:val="21"/>
+              </w:rPr>
+            </w:pPr>
+            <w:r>
+              <w:rPr>
+                <w:rFonts w:ascii="游明朝" w:eastAsia="游明朝" w:hAnsi="游明朝"/>
+                <w:sz w:val="17"/>
+                <w:szCs w:val="21"/>
+              </w:rPr>
+              <w:t>５．地域・行政との連携</w:t>
+            </w:r>
+          </w:p>
+          <w:p>
+            <w:pPr>
+              <w:jc w:val="left"/>
+              <w:rPr>
+                <w:rFonts w:ascii="游明朝" w:eastAsia="游明朝" w:hAnsi="游明朝"/>
+                <w:sz w:val="17"/>
+                <w:szCs w:val="21"/>
+              </w:rPr>
+            </w:pPr>
+            <w:r>
+              <w:rPr>
+                <w:rFonts w:ascii="游明朝" w:eastAsia="游明朝" w:hAnsi="游明朝"/>
+                <w:sz w:val="17"/>
+                <w:szCs w:val="21"/>
+              </w:rPr>
+              <w:t>茨城県の産地化政策と目的が一致するため、県・自治体・地元メディアを無償の拡散チャネルとして活用できます。</w:t>
+            </w:r>
+          </w:p>
+          <w:p>
+            <w:pPr>
+              <w:jc w:val="left"/>
+              <w:rPr>
+                <w:rFonts w:ascii="游明朝" w:eastAsia="游明朝" w:hAnsi="游明朝"/>
+                <w:sz w:val="17"/>
+                <w:szCs w:val="21"/>
+              </w:rPr>
+            </w:pPr>
+            <w:r>
+              <w:rPr>
+                <w:rFonts w:ascii="游明朝" w:eastAsia="游明朝" w:hAnsi="游明朝"/>
+                <w:sz w:val="17"/>
+                <w:szCs w:val="21"/>
+              </w:rPr>
+              <w:t>６．資産が積み上がる</w:t>
+            </w:r>
+          </w:p>
+          <w:p>
+            <w:pPr>
+              <w:jc w:val="left"/>
+              <w:rPr>
+                <w:rFonts w:ascii="游明朝" w:eastAsia="游明朝" w:hAnsi="游明朝"/>
+                <w:sz w:val="17"/>
+                <w:szCs w:val="21"/>
+              </w:rPr>
+            </w:pPr>
+            <w:r>
+              <w:rPr>
+                <w:rFonts w:ascii="游明朝" w:eastAsia="游明朝" w:hAnsi="游明朝"/>
+                <w:sz w:val="17"/>
+                <w:szCs w:val="21"/>
+              </w:rPr>
+              <w:t>ちびフジィ、スタンプ、映像、公開体制 ―― 一度作れば残り、時間とともに価値が増します。７．複数部門で推進できるフジィが「絶滅危惧種を、獲らずに育てる技術」の象徴になることで、広報活動だけでなく、統合報告書・サステナビリティ報告・SDGs（目標14「海の豊かさを守ろう」）の文脈でも語れるようになります。８．来年度の計画として、すぐに動かせる2027年という明確な節目があるため、「いつか実施する案」ではなく「2027年度に実施する計画」として検討できます。第1期の制作物（ちびフジィ、スタンプ128種、体験版）は本エントリーにすべて添付済みです。</w:t>
+            </w:r>
+          </w:p>
+          <w:p>
+            <w:pPr>
+              <w:jc w:val="left"/>
+              <w:rPr>
+                <w:rFonts w:ascii="游明朝" w:eastAsia="游明朝" w:hAnsi="游明朝"/>
+                <w:sz w:val="17"/>
+                <w:szCs w:val="21"/>
+              </w:rPr>
+            </w:pPr>
+          </w:p>
+          <w:p>
+            <w:pPr>
+              <w:jc w:val="left"/>
+              <w:rPr>
+                <w:rFonts w:ascii="游明朝" w:eastAsia="游明朝" w:hAnsi="游明朝"/>
+                <w:sz w:val="17"/>
+                <w:szCs w:val="21"/>
+              </w:rPr>
+            </w:pPr>
+            <w:r>
+              <w:rPr>
+                <w:rFonts w:ascii="游明朝" w:eastAsia="游明朝" w:hAnsi="游明朝"/>
+                <w:sz w:val="17"/>
+                <w:szCs w:val="21"/>
+              </w:rPr>
+              <w:t>■ 2027 年の、ある一日</w:t>
+            </w:r>
+          </w:p>
+          <w:p>
+            <w:pPr>
+              <w:jc w:val="left"/>
+              <w:rPr>
+                <w:rFonts w:ascii="游明朝" w:eastAsia="游明朝" w:hAnsi="游明朝"/>
+                <w:sz w:val="17"/>
+                <w:szCs w:val="21"/>
+              </w:rPr>
+            </w:pPr>
+            <w:r>
+              <w:rPr>
+                <w:rFonts w:ascii="游明朝" w:eastAsia="游明朝" w:hAnsi="游明朝"/>
+                <w:sz w:val="17"/>
+                <w:szCs w:val="21"/>
+              </w:rPr>
+              <w:t>【朝】里美養魚場、給餌の 7 時。水面が沸き立つ 20 秒を飼育員が撮り、ちびフジィの声で「今日もごはん。1 万匹分」と投稿します。県水産課の担当者が、庁内に転送します。</w:t>
+            </w:r>
+          </w:p>
+          <w:p>
+            <w:pPr>
+              <w:jc w:val="left"/>
+              <w:rPr>
+                <w:rFonts w:ascii="游明朝" w:eastAsia="游明朝" w:hAnsi="游明朝"/>
+                <w:sz w:val="17"/>
+                <w:szCs w:val="21"/>
+              </w:rPr>
+            </w:pPr>
+            <w:r>
+              <w:rPr>
+                <w:rFonts w:ascii="游明朝" w:eastAsia="游明朝" w:hAnsi="游明朝"/>
+                <w:sz w:val="17"/>
+                <w:szCs w:val="21"/>
+              </w:rPr>
+              <w:t>【昼】大阪の高校の教室。配布資料の QR コードから 90 秒後、40 台のスマートフォンに成魚が泳いでいます。「バルブの会社。この魚を世界で初めて卵から育てた」。</w:t>
+            </w:r>
+          </w:p>
+          <w:p>
+            <w:pPr>
+              <w:jc w:val="left"/>
+              <w:rPr>
+                <w:rFonts w:ascii="游明朝" w:eastAsia="游明朝" w:hAnsi="游明朝"/>
+                <w:sz w:val="17"/>
+                <w:szCs w:val="21"/>
+              </w:rPr>
+            </w:pPr>
+            <w:r>
+              <w:rPr>
+                <w:rFonts w:ascii="游明朝" w:eastAsia="游明朝" w:hAnsi="游明朝"/>
+                <w:sz w:val="17"/>
+                <w:szCs w:val="21"/>
+              </w:rPr>
+              <w:t>【夕】友だちのグループチャット。「サメじゃないです」のスタンプから会話が始まります。フジキンは一円も払っていません。</w:t>
+            </w:r>
+          </w:p>
+          <w:p>
+            <w:pPr>
+              <w:jc w:val="left"/>
+              <w:rPr>
+                <w:rFonts w:ascii="游明朝" w:eastAsia="游明朝" w:hAnsi="游明朝"/>
+                <w:sz w:val="17"/>
+                <w:szCs w:val="21"/>
+              </w:rPr>
+            </w:pPr>
+            <w:r>
+              <w:rPr>
+                <w:rFonts w:ascii="游明朝" w:eastAsia="游明朝" w:hAnsi="游明朝"/>
+                <w:sz w:val="17"/>
+                <w:szCs w:val="21"/>
+              </w:rPr>
+              <w:t>【夜】どこかの家の食卓。お歳暮の国産キャビア缶に銀色の小さな魚。「里美のやつだ。今度見に行こう」。缶の生産者は、フジキンから稚魚を買う会社です。</w:t>
+            </w:r>
+          </w:p>
+          <w:p>
+            <w:pPr>
+              <w:jc w:val="left"/>
+              <w:rPr>
+                <w:rFonts w:ascii="游明朝" w:eastAsia="游明朝" w:hAnsi="游明朝"/>
+                <w:sz w:val="17"/>
+                <w:szCs w:val="21"/>
+              </w:rPr>
+            </w:pPr>
+            <w:r>
+              <w:rPr>
+                <w:rFonts w:ascii="游明朝" w:eastAsia="游明朝" w:hAnsi="游明朝"/>
+                <w:sz w:val="17"/>
+                <w:szCs w:val="21"/>
+              </w:rPr>
+              <w:t>共通するのは、誰かがフジキンの話を自分の言葉でしていること。それが「覚えられる会社」と「語られる会社」の差です。</w:t>
+            </w:r>
+          </w:p>
+          <w:p>
+            <w:pPr>
+              <w:jc w:val="left"/>
               <w:rPr>
                 <w:rFonts w:ascii="游明朝" w:eastAsia="游明朝" w:hAnsi="游明朝" w:hint="eastAsia"/>
                 <w:sz w:val="17"/>
                 <w:szCs w:val="21"/>
               </w:rPr>
-              <w:t>効果：</w:t>
-            </w:r>
-          </w:p>
-          <w:p>
-            <w:pPr>
-              <w:jc w:val="left"/>
-              <w:rPr>
-                <w:rFonts w:ascii="游明朝" w:eastAsia="游明朝" w:hAnsi="游明朝"/>
-                <w:sz w:val="17"/>
-                <w:szCs w:val="21"/>
-              </w:rPr>
-            </w:pPr>
-            <w:r>
-              <w:rPr>
-                <w:rFonts w:ascii="游明朝" w:eastAsia="游明朝" w:hAnsi="游明朝"/>
-                <w:sz w:val="17"/>
-                <w:szCs w:val="21"/>
-              </w:rPr>
-              <w:t>１．「覚えられる会社」から「語られる会社」へ</w:t>
-            </w:r>
-          </w:p>
-          <w:p>
-            <w:pPr>
-              <w:jc w:val="left"/>
-              <w:rPr>
-                <w:rFonts w:ascii="游明朝" w:eastAsia="游明朝" w:hAnsi="游明朝"/>
-                <w:sz w:val="17"/>
-                <w:szCs w:val="21"/>
-              </w:rPr>
-            </w:pPr>
-            <w:r>
-              <w:rPr>
-                <w:rFonts w:ascii="游明朝" w:eastAsia="游明朝" w:hAnsi="游明朝"/>
-                <w:sz w:val="17"/>
-                <w:szCs w:val="21"/>
-              </w:rPr>
-              <w:t>「バルブの会社が日本のキャビアをつくった」という一文は、聞いた人が翌日 誰かに話したくなる強度を持っています。広告費をかけずに伝播する、唯一の資産です。</w:t>
-            </w:r>
-          </w:p>
-          <w:p>
-            <w:pPr>
-              <w:jc w:val="left"/>
-              <w:rPr>
-                <w:rFonts w:ascii="游明朝" w:eastAsia="游明朝" w:hAnsi="游明朝"/>
-                <w:sz w:val="17"/>
-                <w:szCs w:val="21"/>
-              </w:rPr>
-            </w:pPr>
-            <w:r>
-              <w:rPr>
-                <w:rFonts w:ascii="游明朝" w:eastAsia="游明朝" w:hAnsi="游明朝"/>
-                <w:sz w:val="17"/>
-                <w:szCs w:val="21"/>
-              </w:rPr>
-              <w:t>２．一般層への継続的な到達</w:t>
-            </w:r>
-          </w:p>
-          <w:p>
-            <w:pPr>
-              <w:jc w:val="left"/>
-              <w:rPr>
-                <w:rFonts w:ascii="游明朝" w:eastAsia="游明朝" w:hAnsi="游明朝"/>
-                <w:sz w:val="17"/>
-                <w:szCs w:val="21"/>
-              </w:rPr>
-            </w:pPr>
-            <w:r>
-              <w:rPr>
-                <w:rFonts w:ascii="游明朝" w:eastAsia="游明朝" w:hAnsi="游明朝"/>
-                <w:sz w:val="17"/>
-                <w:szCs w:val="21"/>
-              </w:rPr>
-              <w:t>LINEスタンプは、送信されるかぎり露出が続きます。一度の制作費で、個人間の会話に繰り返し現れます。</w:t>
-            </w:r>
-          </w:p>
-          <w:p>
-            <w:pPr>
-              <w:jc w:val="left"/>
-              <w:rPr>
-                <w:rFonts w:ascii="游明朝" w:eastAsia="游明朝" w:hAnsi="游明朝"/>
-                <w:sz w:val="17"/>
-                <w:szCs w:val="21"/>
-              </w:rPr>
-            </w:pPr>
-            <w:r>
-              <w:rPr>
-                <w:rFonts w:ascii="游明朝" w:eastAsia="游明朝" w:hAnsi="游明朝"/>
-                <w:sz w:val="17"/>
-                <w:szCs w:val="21"/>
-              </w:rPr>
-              <w:t>３．取引先を通じた面の拡大</w:t>
-            </w:r>
-          </w:p>
-          <w:p>
-            <w:pPr>
-              <w:jc w:val="left"/>
-              <w:rPr>
-                <w:rFonts w:ascii="游明朝" w:eastAsia="游明朝" w:hAnsi="游明朝"/>
-                <w:sz w:val="17"/>
-                <w:szCs w:val="21"/>
-              </w:rPr>
-            </w:pPr>
-            <w:r>
-              <w:rPr>
-                <w:rFonts w:ascii="游明朝" w:eastAsia="游明朝" w:hAnsi="游明朝"/>
-                <w:sz w:val="17"/>
-                <w:szCs w:val="21"/>
-              </w:rPr>
-              <w:t>稚魚取引先への無償開放により、フジキンが直接リーチできない一般消費者の食卓にフジィが届きます。</w:t>
-            </w:r>
-          </w:p>
-          <w:p>
-            <w:pPr>
-              <w:jc w:val="left"/>
-              <w:rPr>
-                <w:rFonts w:ascii="游明朝" w:eastAsia="游明朝" w:hAnsi="游明朝"/>
-                <w:sz w:val="17"/>
-                <w:szCs w:val="21"/>
-              </w:rPr>
-            </w:pPr>
-            <w:r>
-              <w:rPr>
-                <w:rFonts w:ascii="游明朝" w:eastAsia="游明朝" w:hAnsi="游明朝"/>
-                <w:sz w:val="17"/>
-                <w:szCs w:val="21"/>
-              </w:rPr>
-              <w:t>４．採用広報への波及</w:t>
-            </w:r>
-          </w:p>
-          <w:p>
-            <w:pPr>
-              <w:jc w:val="left"/>
-              <w:rPr>
-                <w:rFonts w:ascii="游明朝" w:eastAsia="游明朝" w:hAnsi="游明朝"/>
-                <w:sz w:val="17"/>
-                <w:szCs w:val="21"/>
-              </w:rPr>
-            </w:pPr>
-            <w:r>
-              <w:rPr>
-                <w:rFonts w:ascii="游明朝" w:eastAsia="游明朝" w:hAnsi="游明朝"/>
-                <w:sz w:val="17"/>
-                <w:szCs w:val="21"/>
-              </w:rPr>
-              <w:t>生残率5％から世界初に至った11年間は、企業ポリシー「極限への挑戦」そのものです。実話として語れるため、学生が最も反応する物語です。</w:t>
-            </w:r>
-          </w:p>
-          <w:p>
-            <w:pPr>
-              <w:jc w:val="left"/>
-              <w:rPr>
-                <w:rFonts w:ascii="游明朝" w:eastAsia="游明朝" w:hAnsi="游明朝"/>
-                <w:sz w:val="17"/>
-                <w:szCs w:val="21"/>
-              </w:rPr>
-            </w:pPr>
-            <w:r>
-              <w:rPr>
-                <w:rFonts w:ascii="游明朝" w:eastAsia="游明朝" w:hAnsi="游明朝"/>
-                <w:sz w:val="17"/>
-                <w:szCs w:val="21"/>
-              </w:rPr>
-              <w:t>５．地域・行政との連携</w:t>
-            </w:r>
-          </w:p>
-          <w:p>
-            <w:pPr>
-              <w:jc w:val="left"/>
-              <w:rPr>
-                <w:rFonts w:ascii="游明朝" w:eastAsia="游明朝" w:hAnsi="游明朝"/>
-                <w:sz w:val="17"/>
-                <w:szCs w:val="21"/>
-              </w:rPr>
-            </w:pPr>
-            <w:r>
-              <w:rPr>
-                <w:rFonts w:ascii="游明朝" w:eastAsia="游明朝" w:hAnsi="游明朝"/>
-                <w:sz w:val="17"/>
-                <w:szCs w:val="21"/>
-              </w:rPr>
-              <w:t>茨城県の産地化政策と目的が一致するため、県・自治体・地元メディアを無償の拡散チャネルとして活用できます。</w:t>
-            </w:r>
-          </w:p>
-          <w:p>
-            <w:pPr>
-              <w:jc w:val="left"/>
-              <w:rPr>
-                <w:rFonts w:ascii="游明朝" w:eastAsia="游明朝" w:hAnsi="游明朝"/>
-                <w:sz w:val="17"/>
-                <w:szCs w:val="21"/>
-              </w:rPr>
-            </w:pPr>
-            <w:r>
-              <w:rPr>
-                <w:rFonts w:ascii="游明朝" w:eastAsia="游明朝" w:hAnsi="游明朝"/>
-                <w:sz w:val="17"/>
-                <w:szCs w:val="21"/>
-              </w:rPr>
-              <w:t>６．資産が積み上がる</w:t>
-            </w:r>
-          </w:p>
-          <w:p>
-            <w:pPr>
-              <w:jc w:val="left"/>
-              <w:rPr>
-                <w:rFonts w:ascii="游明朝" w:eastAsia="游明朝" w:hAnsi="游明朝"/>
-                <w:sz w:val="17"/>
-                <w:szCs w:val="21"/>
-              </w:rPr>
-            </w:pPr>
-            <w:r>
-              <w:rPr>
-                <w:rFonts w:ascii="游明朝" w:eastAsia="游明朝" w:hAnsi="游明朝"/>
-                <w:sz w:val="17"/>
-                <w:szCs w:val="21"/>
-              </w:rPr>
-              <w:t>ちびフジィ、スタンプ、映像、公開体制 ―― 一度作れば残り、時間とともに価値が増します。７．複数部門で推進できるフジィが「絶滅危惧種を、獲らずに育てる技術」の象徴になることで、広報活動だけでなく、統合報告書・サステナビリティ報告・SDGs（目標14「海の豊かさを守ろう」）の文脈でも語れるようになります。８．来年度の計画として、すぐに動かせる2027年という明確な節目があるため、「いつか実施する案」ではなく「2027年度に実施する計画」として検討できます。第1期の制作物（ちびフジィ、スタンプ128種、体験版）は本エントリーにすべて添付済みです。</w:t>
-            </w:r>
-          </w:p>
-          <w:p>
-            <w:pPr>
-              <w:jc w:val="left"/>
-              <w:rPr>
-                <w:rFonts w:ascii="游明朝" w:eastAsia="游明朝" w:hAnsi="游明朝"/>
-                <w:sz w:val="17"/>
-                <w:szCs w:val="21"/>
-              </w:rPr>
-            </w:pPr>
-          </w:p>
-          <w:p>
-            <w:pPr>
-              <w:jc w:val="left"/>
-              <w:rPr>
-                <w:rFonts w:ascii="游明朝" w:eastAsia="游明朝" w:hAnsi="游明朝"/>
-                <w:sz w:val="17"/>
-                <w:szCs w:val="21"/>
-              </w:rPr>
-            </w:pPr>
-            <w:r>
-              <w:rPr>
-                <w:rFonts w:ascii="游明朝" w:eastAsia="游明朝" w:hAnsi="游明朝"/>
-                <w:sz w:val="17"/>
-                <w:szCs w:val="21"/>
-              </w:rPr>
-              <w:t>■ 2027 年の、ある一日</w:t>
-            </w:r>
-          </w:p>
-          <w:p>
-            <w:pPr>
-              <w:jc w:val="left"/>
-              <w:rPr>
-                <w:rFonts w:ascii="游明朝" w:eastAsia="游明朝" w:hAnsi="游明朝"/>
-                <w:sz w:val="17"/>
-                <w:szCs w:val="21"/>
-              </w:rPr>
-            </w:pPr>
-            <w:r>
-              <w:rPr>
-                <w:rFonts w:ascii="游明朝" w:eastAsia="游明朝" w:hAnsi="游明朝"/>
-                <w:sz w:val="17"/>
-                <w:szCs w:val="21"/>
-              </w:rPr>
-              <w:t>【朝】里美養魚場、給餌の 7 時。水面が沸き立つ 20 秒を飼育員が撮り、ちびフジィの声で「今日もごはん。1 万匹分」と投稿します。県水産課の担当者が、庁内に転送します。</w:t>
-            </w:r>
-          </w:p>
-          <w:p>
-            <w:pPr>
-              <w:jc w:val="left"/>
-              <w:rPr>
-                <w:rFonts w:ascii="游明朝" w:eastAsia="游明朝" w:hAnsi="游明朝"/>
-                <w:sz w:val="17"/>
-                <w:szCs w:val="21"/>
-              </w:rPr>
-            </w:pPr>
-            <w:r>
-              <w:rPr>
-                <w:rFonts w:ascii="游明朝" w:eastAsia="游明朝" w:hAnsi="游明朝"/>
-                <w:sz w:val="17"/>
-                <w:szCs w:val="21"/>
-              </w:rPr>
-              <w:t>【昼】大阪の高校の教室。配布資料の QR コードから 90 秒後、40 台のスマートフォンに成魚が泳いでいます。「バルブの会社。この魚を世界で初めて卵から育てた」。</w:t>
-            </w:r>
-          </w:p>
-          <w:p>
-            <w:pPr>
-              <w:jc w:val="left"/>
-              <w:rPr>
-                <w:rFonts w:ascii="游明朝" w:eastAsia="游明朝" w:hAnsi="游明朝"/>
-                <w:sz w:val="17"/>
-                <w:szCs w:val="21"/>
-              </w:rPr>
-            </w:pPr>
-            <w:r>
-              <w:rPr>
-                <w:rFonts w:ascii="游明朝" w:eastAsia="游明朝" w:hAnsi="游明朝"/>
-                <w:sz w:val="17"/>
-                <w:szCs w:val="21"/>
-              </w:rPr>
-              <w:t>【夕】友だちのグループチャット。「サメじゃないです」のスタンプから会話が始まります。フジキンは一円も払っていません。</w:t>
-            </w:r>
-          </w:p>
-          <w:p>
-            <w:pPr>
-              <w:jc w:val="left"/>
-              <w:rPr>
-                <w:rFonts w:ascii="游明朝" w:eastAsia="游明朝" w:hAnsi="游明朝"/>
-                <w:sz w:val="17"/>
-                <w:szCs w:val="21"/>
-              </w:rPr>
-            </w:pPr>
-            <w:r>
-              <w:rPr>
-                <w:rFonts w:ascii="游明朝" w:eastAsia="游明朝" w:hAnsi="游明朝"/>
-                <w:sz w:val="17"/>
-                <w:szCs w:val="21"/>
-              </w:rPr>
-              <w:t>【夜】どこかの家の食卓。お歳暮の国産キャビア缶に銀色の小さな魚。「里美のやつだ。今度見に行こう」。缶の生産者は、フジキンから稚魚を買う会社です。</w:t>
-            </w:r>
-          </w:p>
-          <w:p>
-            <w:pPr>
-              <w:jc w:val="left"/>
-              <w:rPr>
-                <w:rFonts w:ascii="游明朝" w:eastAsia="游明朝" w:hAnsi="游明朝"/>
+            </w:pPr>
+          </w:p>
+          <w:p>
+            <w:pPr>
+              <w:jc w:val="left"/>
+              <w:rPr>
+                <w:rFonts w:ascii="游明朝" w:eastAsia="游明朝" w:hAnsi="游明朝"/>
+                <w:sz w:val="17"/>
+                <w:szCs w:val="21"/>
+              </w:rPr>
+            </w:pPr>
+          </w:p>
+          <w:p>
+            <w:pPr>
+              <w:jc w:val="left"/>
+              <w:rPr>
+                <w:rFonts w:ascii="游明朝" w:eastAsia="游明朝" w:hAnsi="游明朝"/>
+                <w:sz w:val="17"/>
+                <w:szCs w:val="21"/>
+              </w:rPr>
+            </w:pPr>
+          </w:p>
+          <w:p>
+            <w:pPr>
+              <w:jc w:val="left"/>
+              <w:rPr>
+                <w:rFonts w:ascii="游明朝" w:eastAsia="游明朝" w:hAnsi="游明朝" w:hint="eastAsia"/>
+                <w:sz w:val="17"/>
+                <w:szCs w:val="21"/>
+              </w:rPr>
+            </w:pPr>
+          </w:p>
+          <w:p>
+            <w:pPr>
+              <w:jc w:val="left"/>
+              <w:rPr>
+                <w:rFonts w:ascii="游明朝" w:eastAsia="游明朝" w:hAnsi="游明朝" w:hint="eastAsia"/>
                 <w:color w:val="FF0000"/>
                 <w:sz w:val="17"/>
                 <w:szCs w:val="21"/>
               </w:rPr>
             </w:pPr>
-            <w:r>
-              <w:rPr>
-                <w:rFonts w:ascii="游明朝" w:eastAsia="游明朝" w:hAnsi="游明朝"/>
-                <w:sz w:val="17"/>
-                <w:szCs w:val="21"/>
-              </w:rPr>
-              <w:t>共通するのは、誰かがフジキンの話を自分の言葉でしていること。それが「覚えられる会社」と「語られる会社」の差です。</w:t>
-            </w:r>
           </w:p>
         </w:tc>
       </w:tr>
@@ -1506,7 +1518,7 @@
     <w:p>
       <w:pPr>
         <w:rPr>
-          <w:rFonts w:ascii="游明朝" w:eastAsia="游明朝" w:hAnsi="游明朝"/>
+          <w:rFonts w:ascii="游明朝" w:eastAsia="游明朝" w:hAnsi="游明朝" w:hint="eastAsia"/>
           <w:sz w:val="17"/>
           <w:szCs w:val="21"/>
         </w:rPr>
@@ -1515,7 +1527,7 @@
     <w:p>
       <w:pPr>
         <w:rPr>
-          <w:rFonts w:ascii="游明朝" w:eastAsia="游明朝" w:hAnsi="游明朝"/>
+          <w:rFonts w:ascii="游明朝" w:eastAsia="游明朝" w:hAnsi="游明朝" w:hint="eastAsia"/>
           <w:szCs w:val="21"/>
         </w:rPr>
       </w:pPr>
@@ -1657,7 +1669,7 @@
     <w:p>
       <w:pPr>
         <w:rPr>
-          <w:rFonts w:ascii="游明朝" w:eastAsia="游明朝" w:hAnsi="游明朝"/>
+          <w:rFonts w:ascii="游明朝" w:eastAsia="游明朝" w:hAnsi="游明朝" w:hint="eastAsia"/>
         </w:rPr>
       </w:pPr>
       <w:r>
@@ -2181,7 +2193,6 @@
   <w:style w:type="character" w:default="1" w:styleId="DefaultParagraphFont">
     <w:name w:val="Default Paragraph Font"/>
     <w:uiPriority w:val="1"/>
-    <w:semiHidden/>
     <w:unhideWhenUsed/>
   </w:style>
   <w:style w:type="table" w:default="1" w:styleId="TableNormal">

</xml_diff>